<commit_message>
Ajoute l'analyse de correlation entre stations et une section au rapport
- Nouveau script ML/correlation_stations.py (meme pattern que
  typologie_stations_saisons.py) : matrice de correlation de Pearson entre
  les 14 stations, pour la pluie et la temperature, avec heatmaps.
- Ajoute la section 6.6 au rapport de stage, avec les resultats et la
  convergence observee avec la typologie par k-moyennes du 6.5.
</commit_message>
<xml_diff>
--- a/STAGE PROFESIONNEL/Rapport de stage.docx
+++ b/STAGE PROFESIONNEL/Rapport de stage.docx
@@ -4457,6 +4457,306 @@
           <w:fldChar w:fldCharType="end"/>
         </w:r>
       </w:hyperlink>
+    </w:p>
+    <w:p>
+      <w:pPr>
+        <w:pStyle w:val="Titre2"/>
+        <w:rPr>
+          <w:lang w:val="fr-FR"/>
+        </w:rPr>
+      </w:pPr>
+      <w:r>
+        <w:rPr>
+          <w:lang w:val="fr-FR"/>
+        </w:rPr>
+        <w:t xml:space="preserve">6.6 Corrélation entre stations du réseau</w:t>
+      </w:r>
+    </w:p>
+    <w:p>
+      <w:pPr>
+        <w:spacing w:line="312" w:lineRule="auto"/>
+        <w:jc w:val="both"/>
+        <w:rPr>
+          <w:rFonts w:asciiTheme="majorBidi" w:hAnsiTheme="majorBidi" w:cstheme="majorBidi"/>
+          <w:lang w:val="fr-FR"/>
+        </w:rPr>
+      </w:pPr>
+      <w:r>
+        <w:rPr>
+          <w:rFonts w:asciiTheme="majorBidi" w:hAnsiTheme="majorBidi" w:cstheme="majorBidi"/>
+          <w:lang w:val="fr-FR"/>
+        </w:rPr>
+        <w:t xml:space="preserve">En complément de la typologie par profil climatique moyen (§6.5), une analyse de corrélation (ML/correlation_stations.py) mesure la ressemblance jour à jour entre les 14 stations, pour la pluie et la température, à partir du coefficient de corrélation de Pearson calculé sur l'historique confirmé (« Mesuré ») de chaque paire de stations.</w:t>
+      </w:r>
+    </w:p>
+    <w:p>
+      <w:pPr>
+        <w:spacing w:line="312" w:lineRule="auto"/>
+        <w:jc w:val="both"/>
+        <w:rPr>
+          <w:rFonts w:asciiTheme="majorBidi" w:hAnsiTheme="majorBidi" w:cstheme="majorBidi"/>
+          <w:lang w:val="fr-FR"/>
+        </w:rPr>
+      </w:pPr>
+      <w:r>
+        <w:rPr>
+          <w:rFonts w:asciiTheme="majorBidi" w:hAnsiTheme="majorBidi" w:cstheme="majorBidi"/>
+          <w:lang w:val="fr-FR"/>
+        </w:rPr>
+        <w:t xml:space="preserve">Pour la pluie, la corrélation moyenne inter-stations est de 0,72 (de 0,53 à 0,93 selon les paires) : une valeur relativement élevée, cohérente avec des épisodes pluvieux qui touchent souvent l'ensemble de la plaine du Gharb, même si la quantité exacte reçue reste très locale — un constat qui rejoint directement celui du modèle LSTM (§6.3) : bonne détection de l'occurrence de pluie, quantité prévue peu fiable. La station de Sidi Allal Tazi ressort comme la moins corrélée au reste du réseau.</w:t>
+      </w:r>
+    </w:p>
+    <w:p>
+      <w:pPr>
+        <w:keepNext/>
+        <w:spacing w:after="40"/>
+        <w:jc w:val="center"/>
+        <w:rPr>
+          <w:rFonts w:asciiTheme="majorBidi" w:hAnsiTheme="majorBidi" w:cstheme="majorBidi"/>
+        </w:rPr>
+      </w:pPr>
+      <w:r>
+        <w:rPr>
+          <w:rFonts w:asciiTheme="majorBidi" w:hAnsiTheme="majorBidi" w:cstheme="majorBidi"/>
+          <w:noProof/>
+          <w:lang w:val="fr-FR" w:eastAsia="fr-FR"/>
+        </w:rPr>
+        <w:drawing>
+          <wp:inline distT="0" distB="0" distL="0" distR="0">
+            <wp:extent cx="5760720" cy="5120640"/>
+            <wp:effectExtent l="0" t="0" r="0" b="0"/>
+            <wp:docPr id="218" name="Image 218"/>
+            <wp:cNvGraphicFramePr>
+              <a:graphicFrameLocks xmlns:a="http://schemas.openxmlformats.org/drawingml/2006/main" noChangeAspect="1"/>
+            </wp:cNvGraphicFramePr>
+            <a:graphic xmlns:a="http://schemas.openxmlformats.org/drawingml/2006/main">
+              <a:graphicData uri="http://schemas.openxmlformats.org/drawingml/2006/picture">
+                <pic:pic xmlns:pic="http://schemas.openxmlformats.org/drawingml/2006/picture">
+                  <pic:nvPicPr>
+                    <pic:cNvPr id="218" name="correlation_pluie.png"/>
+                    <pic:cNvPicPr/>
+                  </pic:nvPicPr>
+                  <pic:blipFill>
+                    <a:blip r:embed="rId37"/>
+                    <a:stretch>
+                      <a:fillRect/>
+                    </a:stretch>
+                  </pic:blipFill>
+                  <pic:spPr>
+                    <a:xfrm>
+                      <a:off x="0" y="0"/>
+                      <a:ext cx="5760720" cy="5120640"/>
+                    </a:xfrm>
+                    <a:prstGeom prst="rect">
+                      <a:avLst/>
+                    </a:prstGeom>
+                  </pic:spPr>
+                </pic:pic>
+              </a:graphicData>
+            </a:graphic>
+          </wp:inline>
+        </w:drawing>
+      </w:r>
+    </w:p>
+    <w:p>
+      <w:pPr>
+        <w:pStyle w:val="Légende"/>
+        <w:jc w:val="center"/>
+        <w:rPr>
+          <w:rFonts w:asciiTheme="majorBidi" w:hAnsiTheme="majorBidi" w:cstheme="majorBidi"/>
+          <w:lang w:val="fr-FR"/>
+        </w:rPr>
+      </w:pPr>
+      <w:r>
+        <w:rPr>
+          <w:rFonts w:asciiTheme="majorBidi" w:hAnsiTheme="majorBidi" w:cstheme="majorBidi"/>
+          <w:lang w:val="fr-FR"/>
+        </w:rPr>
+        <w:t xml:space="preserve">Figure </w:t>
+      </w:r>
+      <w:r>
+        <w:rPr>
+          <w:rFonts w:asciiTheme="majorBidi" w:hAnsiTheme="majorBidi" w:cstheme="majorBidi"/>
+        </w:rPr>
+        <w:fldChar w:fldCharType="begin"/>
+      </w:r>
+      <w:r>
+        <w:rPr>
+          <w:rFonts w:asciiTheme="majorBidi" w:hAnsiTheme="majorBidi" w:cstheme="majorBidi"/>
+          <w:lang w:val="fr-FR"/>
+        </w:rPr>
+        <w:instrText xml:space="preserve"> SEQ Figure \* ARABIC </w:instrText>
+      </w:r>
+      <w:r>
+        <w:rPr>
+          <w:rFonts w:asciiTheme="majorBidi" w:hAnsiTheme="majorBidi" w:cstheme="majorBidi"/>
+        </w:rPr>
+        <w:fldChar w:fldCharType="separate"/>
+      </w:r>
+      <w:r>
+        <w:rPr>
+          <w:rFonts w:asciiTheme="majorBidi" w:hAnsiTheme="majorBidi" w:cstheme="majorBidi"/>
+          <w:noProof/>
+          <w:lang w:val="fr-FR"/>
+        </w:rPr>
+        <w:t>#</w:t>
+      </w:r>
+      <w:r>
+        <w:rPr>
+          <w:rFonts w:asciiTheme="majorBidi" w:hAnsiTheme="majorBidi" w:cstheme="majorBidi"/>
+        </w:rPr>
+        <w:fldChar w:fldCharType="end"/>
+      </w:r>
+      <w:r>
+        <w:rPr>
+          <w:rFonts w:asciiTheme="majorBidi" w:hAnsiTheme="majorBidi" w:cstheme="majorBidi"/>
+          <w:lang w:val="fr-FR"/>
+        </w:rPr>
+        <w:t xml:space="preserve">: Corrélation entre stations — pluie journalière</w:t>
+      </w:r>
+    </w:p>
+    <w:p>
+      <w:pPr>
+        <w:spacing w:line="312" w:lineRule="auto"/>
+        <w:jc w:val="both"/>
+        <w:rPr>
+          <w:rFonts w:asciiTheme="majorBidi" w:hAnsiTheme="majorBidi" w:cstheme="majorBidi"/>
+          <w:lang w:val="fr-FR"/>
+        </w:rPr>
+      </w:pPr>
+      <w:r>
+        <w:rPr>
+          <w:rFonts w:asciiTheme="majorBidi" w:hAnsiTheme="majorBidi" w:cstheme="majorBidi"/>
+          <w:lang w:val="fr-FR"/>
+        </w:rPr>
+        <w:t xml:space="preserve">Pour la température, la corrélation moyenne atteint 0,92 et dépasse 0,95 pour la quasi-totalité des paires de stations, à une exception nette : Lamnassra, dont la corrélation avec ses voisines chute entre 0,35 et 0,56, nettement visible sur la carte de chaleur ci-dessous. Cette station fait précisément partie du groupe « plus humide et frais » (avec Sidi Allal Tazi et Kénitra Banlieue) identifié par le regroupement par k-moyennes du §6.5 : deux méthodes indépendantes — profil climatique moyen et corrélation temporelle — convergent ainsi vers les mêmes stations atypiques, ce qui renforce la confiance dans cette typologie.</w:t>
+      </w:r>
+    </w:p>
+    <w:p>
+      <w:pPr>
+        <w:keepNext/>
+        <w:spacing w:after="40"/>
+        <w:jc w:val="center"/>
+        <w:rPr>
+          <w:rFonts w:asciiTheme="majorBidi" w:hAnsiTheme="majorBidi" w:cstheme="majorBidi"/>
+        </w:rPr>
+      </w:pPr>
+      <w:r>
+        <w:rPr>
+          <w:rFonts w:asciiTheme="majorBidi" w:hAnsiTheme="majorBidi" w:cstheme="majorBidi"/>
+          <w:noProof/>
+          <w:lang w:val="fr-FR" w:eastAsia="fr-FR"/>
+        </w:rPr>
+        <w:drawing>
+          <wp:inline distT="0" distB="0" distL="0" distR="0">
+            <wp:extent cx="5760720" cy="5120640"/>
+            <wp:effectExtent l="0" t="0" r="0" b="0"/>
+            <wp:docPr id="219" name="Image 219"/>
+            <wp:cNvGraphicFramePr>
+              <a:graphicFrameLocks xmlns:a="http://schemas.openxmlformats.org/drawingml/2006/main" noChangeAspect="1"/>
+            </wp:cNvGraphicFramePr>
+            <a:graphic xmlns:a="http://schemas.openxmlformats.org/drawingml/2006/main">
+              <a:graphicData uri="http://schemas.openxmlformats.org/drawingml/2006/picture">
+                <pic:pic xmlns:pic="http://schemas.openxmlformats.org/drawingml/2006/picture">
+                  <pic:nvPicPr>
+                    <pic:cNvPr id="219" name="correlation_temperature.png"/>
+                    <pic:cNvPicPr/>
+                  </pic:nvPicPr>
+                  <pic:blipFill>
+                    <a:blip r:embed="rId38"/>
+                    <a:stretch>
+                      <a:fillRect/>
+                    </a:stretch>
+                  </pic:blipFill>
+                  <pic:spPr>
+                    <a:xfrm>
+                      <a:off x="0" y="0"/>
+                      <a:ext cx="5760720" cy="5120640"/>
+                    </a:xfrm>
+                    <a:prstGeom prst="rect">
+                      <a:avLst/>
+                    </a:prstGeom>
+                  </pic:spPr>
+                </pic:pic>
+              </a:graphicData>
+            </a:graphic>
+          </wp:inline>
+        </w:drawing>
+      </w:r>
+    </w:p>
+    <w:p>
+      <w:pPr>
+        <w:pStyle w:val="Légende"/>
+        <w:jc w:val="center"/>
+        <w:rPr>
+          <w:rFonts w:asciiTheme="majorBidi" w:hAnsiTheme="majorBidi" w:cstheme="majorBidi"/>
+          <w:lang w:val="fr-FR"/>
+        </w:rPr>
+      </w:pPr>
+      <w:r>
+        <w:rPr>
+          <w:rFonts w:asciiTheme="majorBidi" w:hAnsiTheme="majorBidi" w:cstheme="majorBidi"/>
+          <w:lang w:val="fr-FR"/>
+        </w:rPr>
+        <w:t xml:space="preserve">Figure </w:t>
+      </w:r>
+      <w:r>
+        <w:rPr>
+          <w:rFonts w:asciiTheme="majorBidi" w:hAnsiTheme="majorBidi" w:cstheme="majorBidi"/>
+        </w:rPr>
+        <w:fldChar w:fldCharType="begin"/>
+      </w:r>
+      <w:r>
+        <w:rPr>
+          <w:rFonts w:asciiTheme="majorBidi" w:hAnsiTheme="majorBidi" w:cstheme="majorBidi"/>
+          <w:lang w:val="fr-FR"/>
+        </w:rPr>
+        <w:instrText xml:space="preserve"> SEQ Figure \* ARABIC </w:instrText>
+      </w:r>
+      <w:r>
+        <w:rPr>
+          <w:rFonts w:asciiTheme="majorBidi" w:hAnsiTheme="majorBidi" w:cstheme="majorBidi"/>
+        </w:rPr>
+        <w:fldChar w:fldCharType="separate"/>
+      </w:r>
+      <w:r>
+        <w:rPr>
+          <w:rFonts w:asciiTheme="majorBidi" w:hAnsiTheme="majorBidi" w:cstheme="majorBidi"/>
+          <w:noProof/>
+          <w:lang w:val="fr-FR"/>
+        </w:rPr>
+        <w:t>#</w:t>
+      </w:r>
+      <w:r>
+        <w:rPr>
+          <w:rFonts w:asciiTheme="majorBidi" w:hAnsiTheme="majorBidi" w:cstheme="majorBidi"/>
+        </w:rPr>
+        <w:fldChar w:fldCharType="end"/>
+      </w:r>
+      <w:r>
+        <w:rPr>
+          <w:rFonts w:asciiTheme="majorBidi" w:hAnsiTheme="majorBidi" w:cstheme="majorBidi"/>
+          <w:lang w:val="fr-FR"/>
+        </w:rPr>
+        <w:t xml:space="preserve">: Corrélation entre stations — température journalière</w:t>
+      </w:r>
+    </w:p>
+    <w:p>
+      <w:pPr>
+        <w:spacing w:line="312" w:lineRule="auto"/>
+        <w:jc w:val="both"/>
+        <w:rPr>
+          <w:rFonts w:asciiTheme="majorBidi" w:hAnsiTheme="majorBidi" w:cstheme="majorBidi"/>
+          <w:lang w:val="fr-FR"/>
+        </w:rPr>
+      </w:pPr>
+      <w:r>
+        <w:rPr>
+          <w:rFonts w:asciiTheme="majorBidi" w:hAnsiTheme="majorBidi" w:cstheme="majorBidi"/>
+          <w:lang w:val="fr-FR"/>
+        </w:rPr>
+        <w:t xml:space="preserve">Au-delà de cette validation croisée, une telle analyse offre un intérêt opérationnel : une station qui décroche soudainement de sa corrélation habituelle avec ses voisines constitue un signal supplémentaire de panne capteur, et la station la plus corrélée à une autre peut servir de référence pour estimer des valeurs manquantes en cas d'indisponibilité temporaire.</w:t>
+      </w:r>
     </w:p>
     <w:p>
       <w:pPr>

</xml_diff>

<commit_message>
Reduit l'historique des indicateurs a 15 jours et allege le rapport
- Page Indicateurs : fenetre d'historique 30 -> 15 derniers jours (table
  et graphique), coherent avec le "15 derniers jours" utilise ailleurs
  (releve des precipitations).
- Rapport de stage : corrige une coquille ("stage professionne"), et
  reecrit les paragraphes de la section 6.6 (correlation entre stations)
  pour retirer les tournures de conclusion trop artificielles.
</commit_message>
<xml_diff>
--- a/STAGE PROFESIONNEL/Rapport de stage.docx
+++ b/STAGE PROFESIONNEL/Rapport de stage.docx
@@ -90,7 +90,7 @@
           <w:lang w:val="fr-FR" w:eastAsia="fr-FR"/>
         </w:rPr>
         <w:drawing>
-          <wp:anchor distT="0" distB="0" distL="114300" distR="114300" simplePos="0" relativeHeight="251649024" behindDoc="0" locked="0" layoutInCell="1" allowOverlap="1" wp14:anchorId="0B3D9FC6" wp14:editId="56273357">
+          <wp:anchor distT="0" distB="0" distL="114300" distR="114300" simplePos="0" relativeHeight="251650048" behindDoc="0" locked="0" layoutInCell="1" allowOverlap="1" wp14:anchorId="0B3D9FC6" wp14:editId="56273357">
             <wp:simplePos x="0" y="0"/>
             <wp:positionH relativeFrom="margin">
               <wp:posOffset>3811905</wp:posOffset>
@@ -167,7 +167,7 @@
           <w:lang w:val="fr-FR" w:eastAsia="fr-FR"/>
         </w:rPr>
         <w:drawing>
-          <wp:anchor distT="0" distB="0" distL="114300" distR="114300" simplePos="0" relativeHeight="251651072" behindDoc="1" locked="0" layoutInCell="1" allowOverlap="1" wp14:anchorId="27F3388F" wp14:editId="38CD83B1">
+          <wp:anchor distT="0" distB="0" distL="114300" distR="114300" simplePos="0" relativeHeight="251653120" behindDoc="1" locked="0" layoutInCell="1" allowOverlap="1" wp14:anchorId="27F3388F" wp14:editId="38CD83B1">
             <wp:simplePos x="0" y="0"/>
             <wp:positionH relativeFrom="column">
               <wp:posOffset>313164</wp:posOffset>
@@ -552,7 +552,7 @@
         <mc:AlternateContent>
           <mc:Choice Requires="wps">
             <w:drawing>
-              <wp:anchor distT="45720" distB="45720" distL="114300" distR="114300" simplePos="0" relativeHeight="251644928" behindDoc="0" locked="0" layoutInCell="1" allowOverlap="1" wp14:anchorId="5FB0246B" wp14:editId="0372028E">
+              <wp:anchor distT="45720" distB="45720" distL="114300" distR="114300" simplePos="0" relativeHeight="251643904" behindDoc="0" locked="0" layoutInCell="1" allowOverlap="1" wp14:anchorId="5FB0246B" wp14:editId="0372028E">
                 <wp:simplePos x="0" y="0"/>
                 <wp:positionH relativeFrom="column">
                   <wp:posOffset>3744291</wp:posOffset>
@@ -662,7 +662,7 @@
                 <v:stroke joinstyle="miter"/>
                 <v:path gradientshapeok="t" o:connecttype="rect"/>
               </v:shapetype>
-              <v:shape id="Zone de texte 2" o:spid="_x0000_s1026" type="#_x0000_t202" style="position:absolute;left:0;text-align:left;margin-left:294.85pt;margin-top:21.75pt;width:192.25pt;height:125.4pt;z-index:251644928;visibility:visible;mso-wrap-style:square;mso-width-percent:0;mso-height-percent:0;mso-wrap-distance-left:9pt;mso-wrap-distance-top:3.6pt;mso-wrap-distance-right:9pt;mso-wrap-distance-bottom:3.6pt;mso-position-horizontal:absolute;mso-position-horizontal-relative:text;mso-position-vertical:absolute;mso-position-vertical-relative:text;mso-width-percent:0;mso-height-percent:0;mso-width-relative:margin;mso-height-relative:margin;v-text-anchor:top" o:gfxdata="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" strokecolor="white [3212]">
+              <v:shape id="Zone de texte 2" o:spid="_x0000_s1026" type="#_x0000_t202" style="position:absolute;left:0;text-align:left;margin-left:294.85pt;margin-top:21.75pt;width:192.25pt;height:125.4pt;z-index:251643904;visibility:visible;mso-wrap-style:square;mso-width-percent:0;mso-height-percent:0;mso-wrap-distance-left:9pt;mso-wrap-distance-top:3.6pt;mso-wrap-distance-right:9pt;mso-wrap-distance-bottom:3.6pt;mso-position-horizontal:absolute;mso-position-horizontal-relative:text;mso-position-vertical:absolute;mso-position-vertical-relative:text;mso-width-percent:0;mso-height-percent:0;mso-width-relative:margin;mso-height-relative:margin;v-text-anchor:top" o:gfxdata="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" strokecolor="white [3212]">
                 <v:textbox>
                   <w:txbxContent>
                     <w:p>
@@ -741,8 +741,6 @@
         </w:rPr>
         <w:t>Encadrant professionnel:</w:t>
       </w:r>
-      <w:bookmarkStart w:id="0" w:name="_GoBack"/>
-      <w:bookmarkEnd w:id="0"/>
     </w:p>
     <w:p>
       <w:pPr>
@@ -852,7 +850,7 @@
           <w:lang w:val="fr-FR"/>
         </w:rPr>
       </w:pPr>
-      <w:bookmarkStart w:id="1" w:name="_Toc236349560"/>
+      <w:bookmarkStart w:id="0" w:name="_Toc236915087"/>
       <w:r>
         <w:rPr>
           <w:lang w:val="fr-FR"/>
@@ -860,7 +858,7 @@
         <w:lastRenderedPageBreak/>
         <w:t>Remerciements</w:t>
       </w:r>
-      <w:bookmarkEnd w:id="1"/>
+      <w:bookmarkEnd w:id="0"/>
     </w:p>
     <w:p>
       <w:pPr>
@@ -948,7 +946,7 @@
           <w:lang w:val="fr-FR"/>
         </w:rPr>
       </w:pPr>
-      <w:bookmarkStart w:id="2" w:name="_Toc236349561"/>
+      <w:bookmarkStart w:id="1" w:name="_Toc236915088"/>
       <w:r>
         <w:rPr>
           <w:lang w:val="fr-FR"/>
@@ -956,7 +954,7 @@
         <w:lastRenderedPageBreak/>
         <w:t>Table des matières</w:t>
       </w:r>
-      <w:bookmarkEnd w:id="2"/>
+      <w:bookmarkEnd w:id="1"/>
     </w:p>
     <w:p>
       <w:pPr>
@@ -1000,7 +998,7 @@
         </w:rPr>
         <w:fldChar w:fldCharType="separate"/>
       </w:r>
-      <w:hyperlink w:anchor="_Toc236349560" w:history="1">
+      <w:hyperlink w:anchor="_Toc236915087" w:history="1">
         <w:r>
           <w:rPr>
             <w:rStyle w:val="Lienhypertexte"/>
@@ -1032,7 +1030,7 @@
             <w:noProof/>
             <w:webHidden/>
           </w:rPr>
-          <w:instrText xml:space="preserve"> PAGEREF _Toc236349560 \h </w:instrText>
+          <w:instrText xml:space="preserve"> PAGEREF _Toc236915087 \h </w:instrText>
         </w:r>
         <w:r>
           <w:rPr>
@@ -1079,7 +1077,7 @@
           <w:lang w:val="fr-FR" w:eastAsia="fr-FR"/>
         </w:rPr>
       </w:pPr>
-      <w:hyperlink w:anchor="_Toc236349561" w:history="1">
+      <w:hyperlink w:anchor="_Toc236915088" w:history="1">
         <w:r>
           <w:rPr>
             <w:rStyle w:val="Lienhypertexte"/>
@@ -1111,7 +1109,7 @@
             <w:noProof/>
             <w:webHidden/>
           </w:rPr>
-          <w:instrText xml:space="preserve"> PAGEREF _Toc236349561 \h </w:instrText>
+          <w:instrText xml:space="preserve"> PAGEREF _Toc236915088 \h </w:instrText>
         </w:r>
         <w:r>
           <w:rPr>
@@ -1158,7 +1156,7 @@
           <w:lang w:val="fr-FR" w:eastAsia="fr-FR"/>
         </w:rPr>
       </w:pPr>
-      <w:hyperlink w:anchor="_Toc236349562" w:history="1">
+      <w:hyperlink w:anchor="_Toc236915089" w:history="1">
         <w:r>
           <w:rPr>
             <w:rStyle w:val="Lienhypertexte"/>
@@ -1190,7 +1188,7 @@
             <w:noProof/>
             <w:webHidden/>
           </w:rPr>
-          <w:instrText xml:space="preserve"> PAGEREF _Toc236349562 \h </w:instrText>
+          <w:instrText xml:space="preserve"> PAGEREF _Toc236915089 \h </w:instrText>
         </w:r>
         <w:r>
           <w:rPr>
@@ -1237,7 +1235,7 @@
           <w:lang w:val="fr-FR" w:eastAsia="fr-FR"/>
         </w:rPr>
       </w:pPr>
-      <w:hyperlink w:anchor="_Toc236349563" w:history="1">
+      <w:hyperlink w:anchor="_Toc236915090" w:history="1">
         <w:r>
           <w:rPr>
             <w:rStyle w:val="Lienhypertexte"/>
@@ -1269,7 +1267,7 @@
             <w:noProof/>
             <w:webHidden/>
           </w:rPr>
-          <w:instrText xml:space="preserve"> PAGEREF _Toc236349563 \h </w:instrText>
+          <w:instrText xml:space="preserve"> PAGEREF _Toc236915090 \h </w:instrText>
         </w:r>
         <w:r>
           <w:rPr>
@@ -1316,7 +1314,7 @@
           <w:lang w:val="fr-FR" w:eastAsia="fr-FR"/>
         </w:rPr>
       </w:pPr>
-      <w:hyperlink w:anchor="_Toc236349564" w:history="1">
+      <w:hyperlink w:anchor="_Toc236915091" w:history="1">
         <w:r>
           <w:rPr>
             <w:rStyle w:val="Lienhypertexte"/>
@@ -1348,7 +1346,7 @@
             <w:noProof/>
             <w:webHidden/>
           </w:rPr>
-          <w:instrText xml:space="preserve"> PAGEREF _Toc236349564 \h </w:instrText>
+          <w:instrText xml:space="preserve"> PAGEREF _Toc236915091 \h </w:instrText>
         </w:r>
         <w:r>
           <w:rPr>
@@ -1395,7 +1393,7 @@
           <w:lang w:val="fr-FR" w:eastAsia="fr-FR"/>
         </w:rPr>
       </w:pPr>
-      <w:hyperlink w:anchor="_Toc236349565" w:history="1">
+      <w:hyperlink w:anchor="_Toc236915092" w:history="1">
         <w:r>
           <w:rPr>
             <w:rStyle w:val="Lienhypertexte"/>
@@ -1427,7 +1425,7 @@
             <w:noProof/>
             <w:webHidden/>
           </w:rPr>
-          <w:instrText xml:space="preserve"> PAGEREF _Toc236349565 \h </w:instrText>
+          <w:instrText xml:space="preserve"> PAGEREF _Toc236915092 \h </w:instrText>
         </w:r>
         <w:r>
           <w:rPr>
@@ -1474,7 +1472,7 @@
           <w:lang w:val="fr-FR" w:eastAsia="fr-FR"/>
         </w:rPr>
       </w:pPr>
-      <w:hyperlink w:anchor="_Toc236349566" w:history="1">
+      <w:hyperlink w:anchor="_Toc236915093" w:history="1">
         <w:r>
           <w:rPr>
             <w:rStyle w:val="Lienhypertexte"/>
@@ -1506,7 +1504,7 @@
             <w:noProof/>
             <w:webHidden/>
           </w:rPr>
-          <w:instrText xml:space="preserve"> PAGEREF _Toc236349566 \h </w:instrText>
+          <w:instrText xml:space="preserve"> PAGEREF _Toc236915093 \h </w:instrText>
         </w:r>
         <w:r>
           <w:rPr>
@@ -1553,7 +1551,7 @@
           <w:lang w:val="fr-FR" w:eastAsia="fr-FR"/>
         </w:rPr>
       </w:pPr>
-      <w:hyperlink w:anchor="_Toc236349567" w:history="1">
+      <w:hyperlink w:anchor="_Toc236915094" w:history="1">
         <w:r>
           <w:rPr>
             <w:rStyle w:val="Lienhypertexte"/>
@@ -1585,7 +1583,7 @@
             <w:noProof/>
             <w:webHidden/>
           </w:rPr>
-          <w:instrText xml:space="preserve"> PAGEREF _Toc236349567 \h </w:instrText>
+          <w:instrText xml:space="preserve"> PAGEREF _Toc236915094 \h </w:instrText>
         </w:r>
         <w:r>
           <w:rPr>
@@ -1632,7 +1630,7 @@
           <w:lang w:val="fr-FR" w:eastAsia="fr-FR"/>
         </w:rPr>
       </w:pPr>
-      <w:hyperlink w:anchor="_Toc236349568" w:history="1">
+      <w:hyperlink w:anchor="_Toc236915095" w:history="1">
         <w:r>
           <w:rPr>
             <w:rStyle w:val="Lienhypertexte"/>
@@ -1664,7 +1662,7 @@
             <w:noProof/>
             <w:webHidden/>
           </w:rPr>
-          <w:instrText xml:space="preserve"> PAGEREF _Toc236349568 \h </w:instrText>
+          <w:instrText xml:space="preserve"> PAGEREF _Toc236915095 \h </w:instrText>
         </w:r>
         <w:r>
           <w:rPr>
@@ -1711,7 +1709,7 @@
           <w:lang w:val="fr-FR" w:eastAsia="fr-FR"/>
         </w:rPr>
       </w:pPr>
-      <w:hyperlink w:anchor="_Toc236349569" w:history="1">
+      <w:hyperlink w:anchor="_Toc236915096" w:history="1">
         <w:r>
           <w:rPr>
             <w:rStyle w:val="Lienhypertexte"/>
@@ -1743,7 +1741,7 @@
             <w:noProof/>
             <w:webHidden/>
           </w:rPr>
-          <w:instrText xml:space="preserve"> PAGEREF _Toc236349569 \h </w:instrText>
+          <w:instrText xml:space="preserve"> PAGEREF _Toc236915096 \h </w:instrText>
         </w:r>
         <w:r>
           <w:rPr>
@@ -1790,7 +1788,7 @@
           <w:lang w:val="fr-FR" w:eastAsia="fr-FR"/>
         </w:rPr>
       </w:pPr>
-      <w:hyperlink w:anchor="_Toc236349570" w:history="1">
+      <w:hyperlink w:anchor="_Toc236915097" w:history="1">
         <w:r>
           <w:rPr>
             <w:rStyle w:val="Lienhypertexte"/>
@@ -1822,7 +1820,7 @@
             <w:noProof/>
             <w:webHidden/>
           </w:rPr>
-          <w:instrText xml:space="preserve"> PAGEREF _Toc236349570 \h </w:instrText>
+          <w:instrText xml:space="preserve"> PAGEREF _Toc236915097 \h </w:instrText>
         </w:r>
         <w:r>
           <w:rPr>
@@ -1869,7 +1867,7 @@
           <w:lang w:val="fr-FR" w:eastAsia="fr-FR"/>
         </w:rPr>
       </w:pPr>
-      <w:hyperlink w:anchor="_Toc236349571" w:history="1">
+      <w:hyperlink w:anchor="_Toc236915098" w:history="1">
         <w:r>
           <w:rPr>
             <w:rStyle w:val="Lienhypertexte"/>
@@ -1900,7 +1898,7 @@
             <w:noProof/>
             <w:webHidden/>
           </w:rPr>
-          <w:instrText xml:space="preserve"> PAGEREF _Toc236349571 \h </w:instrText>
+          <w:instrText xml:space="preserve"> PAGEREF _Toc236915098 \h </w:instrText>
         </w:r>
         <w:r>
           <w:rPr>
@@ -1947,7 +1945,7 @@
           <w:lang w:val="fr-FR" w:eastAsia="fr-FR"/>
         </w:rPr>
       </w:pPr>
-      <w:hyperlink w:anchor="_Toc236349572" w:history="1">
+      <w:hyperlink w:anchor="_Toc236915099" w:history="1">
         <w:r>
           <w:rPr>
             <w:rStyle w:val="Lienhypertexte"/>
@@ -1978,7 +1976,7 @@
             <w:noProof/>
             <w:webHidden/>
           </w:rPr>
-          <w:instrText xml:space="preserve"> PAGEREF _Toc236349572 \h </w:instrText>
+          <w:instrText xml:space="preserve"> PAGEREF _Toc236915099 \h </w:instrText>
         </w:r>
         <w:r>
           <w:rPr>
@@ -2025,7 +2023,7 @@
           <w:lang w:val="fr-FR" w:eastAsia="fr-FR"/>
         </w:rPr>
       </w:pPr>
-      <w:hyperlink w:anchor="_Toc236349573" w:history="1">
+      <w:hyperlink w:anchor="_Toc236915100" w:history="1">
         <w:r>
           <w:rPr>
             <w:rStyle w:val="Lienhypertexte"/>
@@ -2056,7 +2054,7 @@
             <w:noProof/>
             <w:webHidden/>
           </w:rPr>
-          <w:instrText xml:space="preserve"> PAGEREF _Toc236349573 \h </w:instrText>
+          <w:instrText xml:space="preserve"> PAGEREF _Toc236915100 \h </w:instrText>
         </w:r>
         <w:r>
           <w:rPr>
@@ -2103,7 +2101,7 @@
           <w:lang w:val="fr-FR" w:eastAsia="fr-FR"/>
         </w:rPr>
       </w:pPr>
-      <w:hyperlink w:anchor="_Toc236349574" w:history="1">
+      <w:hyperlink w:anchor="_Toc236915101" w:history="1">
         <w:r>
           <w:rPr>
             <w:rStyle w:val="Lienhypertexte"/>
@@ -2134,7 +2132,7 @@
             <w:noProof/>
             <w:webHidden/>
           </w:rPr>
-          <w:instrText xml:space="preserve"> PAGEREF _Toc236349574 \h </w:instrText>
+          <w:instrText xml:space="preserve"> PAGEREF _Toc236915101 \h </w:instrText>
         </w:r>
         <w:r>
           <w:rPr>
@@ -2181,7 +2179,7 @@
           <w:lang w:val="fr-FR" w:eastAsia="fr-FR"/>
         </w:rPr>
       </w:pPr>
-      <w:hyperlink w:anchor="_Toc236349575" w:history="1">
+      <w:hyperlink w:anchor="_Toc236915102" w:history="1">
         <w:r>
           <w:rPr>
             <w:rStyle w:val="Lienhypertexte"/>
@@ -2212,7 +2210,7 @@
             <w:noProof/>
             <w:webHidden/>
           </w:rPr>
-          <w:instrText xml:space="preserve"> PAGEREF _Toc236349575 \h </w:instrText>
+          <w:instrText xml:space="preserve"> PAGEREF _Toc236915102 \h </w:instrText>
         </w:r>
         <w:r>
           <w:rPr>
@@ -2259,7 +2257,7 @@
           <w:lang w:val="fr-FR" w:eastAsia="fr-FR"/>
         </w:rPr>
       </w:pPr>
-      <w:hyperlink w:anchor="_Toc236349576" w:history="1">
+      <w:hyperlink w:anchor="_Toc236915103" w:history="1">
         <w:r>
           <w:rPr>
             <w:rStyle w:val="Lienhypertexte"/>
@@ -2290,7 +2288,7 @@
             <w:noProof/>
             <w:webHidden/>
           </w:rPr>
-          <w:instrText xml:space="preserve"> PAGEREF _Toc236349576 \h </w:instrText>
+          <w:instrText xml:space="preserve"> PAGEREF _Toc236915103 \h </w:instrText>
         </w:r>
         <w:r>
           <w:rPr>
@@ -2337,7 +2335,7 @@
           <w:lang w:val="fr-FR" w:eastAsia="fr-FR"/>
         </w:rPr>
       </w:pPr>
-      <w:hyperlink w:anchor="_Toc236349577" w:history="1">
+      <w:hyperlink w:anchor="_Toc236915104" w:history="1">
         <w:r>
           <w:rPr>
             <w:rStyle w:val="Lienhypertexte"/>
@@ -2368,7 +2366,7 @@
             <w:noProof/>
             <w:webHidden/>
           </w:rPr>
-          <w:instrText xml:space="preserve"> PAGEREF _Toc236349577 \h </w:instrText>
+          <w:instrText xml:space="preserve"> PAGEREF _Toc236915104 \h </w:instrText>
         </w:r>
         <w:r>
           <w:rPr>
@@ -2415,7 +2413,7 @@
           <w:lang w:val="fr-FR" w:eastAsia="fr-FR"/>
         </w:rPr>
       </w:pPr>
-      <w:hyperlink w:anchor="_Toc236349578" w:history="1">
+      <w:hyperlink w:anchor="_Toc236915105" w:history="1">
         <w:r>
           <w:rPr>
             <w:rStyle w:val="Lienhypertexte"/>
@@ -2447,7 +2445,7 @@
             <w:noProof/>
             <w:webHidden/>
           </w:rPr>
-          <w:instrText xml:space="preserve"> PAGEREF _Toc236349578 \h </w:instrText>
+          <w:instrText xml:space="preserve"> PAGEREF _Toc236915105 \h </w:instrText>
         </w:r>
         <w:r>
           <w:rPr>
@@ -2494,7 +2492,7 @@
           <w:lang w:val="fr-FR" w:eastAsia="fr-FR"/>
         </w:rPr>
       </w:pPr>
-      <w:hyperlink w:anchor="_Toc236349579" w:history="1">
+      <w:hyperlink w:anchor="_Toc236915106" w:history="1">
         <w:r>
           <w:rPr>
             <w:rStyle w:val="Lienhypertexte"/>
@@ -2526,7 +2524,7 @@
             <w:noProof/>
             <w:webHidden/>
           </w:rPr>
-          <w:instrText xml:space="preserve"> PAGEREF _Toc236349579 \h </w:instrText>
+          <w:instrText xml:space="preserve"> PAGEREF _Toc236915106 \h </w:instrText>
         </w:r>
         <w:r>
           <w:rPr>
@@ -2573,7 +2571,7 @@
           <w:lang w:val="fr-FR" w:eastAsia="fr-FR"/>
         </w:rPr>
       </w:pPr>
-      <w:hyperlink w:anchor="_Toc236349580" w:history="1">
+      <w:hyperlink w:anchor="_Toc236915107" w:history="1">
         <w:r>
           <w:rPr>
             <w:rStyle w:val="Lienhypertexte"/>
@@ -2605,7 +2603,7 @@
             <w:noProof/>
             <w:webHidden/>
           </w:rPr>
-          <w:instrText xml:space="preserve"> PAGEREF _Toc236349580 \h </w:instrText>
+          <w:instrText xml:space="preserve"> PAGEREF _Toc236915107 \h </w:instrText>
         </w:r>
         <w:r>
           <w:rPr>
@@ -2652,7 +2650,7 @@
           <w:lang w:val="fr-FR" w:eastAsia="fr-FR"/>
         </w:rPr>
       </w:pPr>
-      <w:hyperlink w:anchor="_Toc236349581" w:history="1">
+      <w:hyperlink w:anchor="_Toc236915108" w:history="1">
         <w:r>
           <w:rPr>
             <w:rStyle w:val="Lienhypertexte"/>
@@ -2684,7 +2682,7 @@
             <w:noProof/>
             <w:webHidden/>
           </w:rPr>
-          <w:instrText xml:space="preserve"> PAGEREF _Toc236349581 \h </w:instrText>
+          <w:instrText xml:space="preserve"> PAGEREF _Toc236915108 \h </w:instrText>
         </w:r>
         <w:r>
           <w:rPr>
@@ -2731,7 +2729,7 @@
           <w:lang w:val="fr-FR" w:eastAsia="fr-FR"/>
         </w:rPr>
       </w:pPr>
-      <w:hyperlink w:anchor="_Toc236349582" w:history="1">
+      <w:hyperlink w:anchor="_Toc236915109" w:history="1">
         <w:r>
           <w:rPr>
             <w:rStyle w:val="Lienhypertexte"/>
@@ -2763,7 +2761,7 @@
             <w:noProof/>
             <w:webHidden/>
           </w:rPr>
-          <w:instrText xml:space="preserve"> PAGEREF _Toc236349582 \h </w:instrText>
+          <w:instrText xml:space="preserve"> PAGEREF _Toc236915109 \h </w:instrText>
         </w:r>
         <w:r>
           <w:rPr>
@@ -2810,7 +2808,7 @@
           <w:lang w:val="fr-FR" w:eastAsia="fr-FR"/>
         </w:rPr>
       </w:pPr>
-      <w:hyperlink w:anchor="_Toc236349583" w:history="1">
+      <w:hyperlink w:anchor="_Toc236915110" w:history="1">
         <w:r>
           <w:rPr>
             <w:rStyle w:val="Lienhypertexte"/>
@@ -2842,7 +2840,7 @@
             <w:noProof/>
             <w:webHidden/>
           </w:rPr>
-          <w:instrText xml:space="preserve"> PAGEREF _Toc236349583 \h </w:instrText>
+          <w:instrText xml:space="preserve"> PAGEREF _Toc236915110 \h </w:instrText>
         </w:r>
         <w:r>
           <w:rPr>
@@ -2889,7 +2887,7 @@
           <w:lang w:val="fr-FR" w:eastAsia="fr-FR"/>
         </w:rPr>
       </w:pPr>
-      <w:hyperlink w:anchor="_Toc236349584" w:history="1">
+      <w:hyperlink w:anchor="_Toc236915111" w:history="1">
         <w:r>
           <w:rPr>
             <w:rStyle w:val="Lienhypertexte"/>
@@ -2921,7 +2919,7 @@
             <w:noProof/>
             <w:webHidden/>
           </w:rPr>
-          <w:instrText xml:space="preserve"> PAGEREF _Toc236349584 \h </w:instrText>
+          <w:instrText xml:space="preserve"> PAGEREF _Toc236915111 \h </w:instrText>
         </w:r>
         <w:r>
           <w:rPr>
@@ -2968,7 +2966,7 @@
           <w:lang w:val="fr-FR" w:eastAsia="fr-FR"/>
         </w:rPr>
       </w:pPr>
-      <w:hyperlink w:anchor="_Toc236349585" w:history="1">
+      <w:hyperlink w:anchor="_Toc236915112" w:history="1">
         <w:r>
           <w:rPr>
             <w:rStyle w:val="Lienhypertexte"/>
@@ -3000,7 +2998,7 @@
             <w:noProof/>
             <w:webHidden/>
           </w:rPr>
-          <w:instrText xml:space="preserve"> PAGEREF _Toc236349585 \h </w:instrText>
+          <w:instrText xml:space="preserve"> PAGEREF _Toc236915112 \h </w:instrText>
         </w:r>
         <w:r>
           <w:rPr>
@@ -3047,7 +3045,7 @@
           <w:lang w:val="fr-FR" w:eastAsia="fr-FR"/>
         </w:rPr>
       </w:pPr>
-      <w:hyperlink w:anchor="_Toc236349586" w:history="1">
+      <w:hyperlink w:anchor="_Toc236915113" w:history="1">
         <w:r>
           <w:rPr>
             <w:rStyle w:val="Lienhypertexte"/>
@@ -3079,7 +3077,7 @@
             <w:noProof/>
             <w:webHidden/>
           </w:rPr>
-          <w:instrText xml:space="preserve"> PAGEREF _Toc236349586 \h </w:instrText>
+          <w:instrText xml:space="preserve"> PAGEREF _Toc236915113 \h </w:instrText>
         </w:r>
         <w:r>
           <w:rPr>
@@ -3126,7 +3124,7 @@
           <w:lang w:val="fr-FR" w:eastAsia="fr-FR"/>
         </w:rPr>
       </w:pPr>
-      <w:hyperlink w:anchor="_Toc236349587" w:history="1">
+      <w:hyperlink w:anchor="_Toc236915114" w:history="1">
         <w:r>
           <w:rPr>
             <w:rStyle w:val="Lienhypertexte"/>
@@ -3158,7 +3156,7 @@
             <w:noProof/>
             <w:webHidden/>
           </w:rPr>
-          <w:instrText xml:space="preserve"> PAGEREF _Toc236349587 \h </w:instrText>
+          <w:instrText xml:space="preserve"> PAGEREF _Toc236915114 \h </w:instrText>
         </w:r>
         <w:r>
           <w:rPr>
@@ -3205,7 +3203,7 @@
           <w:lang w:val="fr-FR" w:eastAsia="fr-FR"/>
         </w:rPr>
       </w:pPr>
-      <w:hyperlink w:anchor="_Toc236349588" w:history="1">
+      <w:hyperlink w:anchor="_Toc236915115" w:history="1">
         <w:r>
           <w:rPr>
             <w:rStyle w:val="Lienhypertexte"/>
@@ -3237,7 +3235,7 @@
             <w:noProof/>
             <w:webHidden/>
           </w:rPr>
-          <w:instrText xml:space="preserve"> PAGEREF _Toc236349588 \h </w:instrText>
+          <w:instrText xml:space="preserve"> PAGEREF _Toc236915115 \h </w:instrText>
         </w:r>
         <w:r>
           <w:rPr>
@@ -3284,7 +3282,7 @@
           <w:lang w:val="fr-FR" w:eastAsia="fr-FR"/>
         </w:rPr>
       </w:pPr>
-      <w:hyperlink w:anchor="_Toc236349589" w:history="1">
+      <w:hyperlink w:anchor="_Toc236915116" w:history="1">
         <w:r>
           <w:rPr>
             <w:rStyle w:val="Lienhypertexte"/>
@@ -3316,7 +3314,7 @@
             <w:noProof/>
             <w:webHidden/>
           </w:rPr>
-          <w:instrText xml:space="preserve"> PAGEREF _Toc236349589 \h </w:instrText>
+          <w:instrText xml:space="preserve"> PAGEREF _Toc236915116 \h </w:instrText>
         </w:r>
         <w:r>
           <w:rPr>
@@ -3363,7 +3361,7 @@
           <w:lang w:val="fr-FR" w:eastAsia="fr-FR"/>
         </w:rPr>
       </w:pPr>
-      <w:hyperlink w:anchor="_Toc236349590" w:history="1">
+      <w:hyperlink w:anchor="_Toc236915117" w:history="1">
         <w:r>
           <w:rPr>
             <w:rStyle w:val="Lienhypertexte"/>
@@ -3395,7 +3393,7 @@
             <w:noProof/>
             <w:webHidden/>
           </w:rPr>
-          <w:instrText xml:space="preserve"> PAGEREF _Toc236349590 \h </w:instrText>
+          <w:instrText xml:space="preserve"> PAGEREF _Toc236915117 \h </w:instrText>
         </w:r>
         <w:r>
           <w:rPr>
@@ -3418,7 +3416,7 @@
             <w:noProof/>
             <w:webHidden/>
           </w:rPr>
-          <w:t>17</w:t>
+          <w:t>16</w:t>
         </w:r>
         <w:r>
           <w:rPr>
@@ -3442,7 +3440,7 @@
           <w:lang w:val="fr-FR" w:eastAsia="fr-FR"/>
         </w:rPr>
       </w:pPr>
-      <w:hyperlink w:anchor="_Toc236349591" w:history="1">
+      <w:hyperlink w:anchor="_Toc236915118" w:history="1">
         <w:r>
           <w:rPr>
             <w:rStyle w:val="Lienhypertexte"/>
@@ -3474,7 +3472,7 @@
             <w:noProof/>
             <w:webHidden/>
           </w:rPr>
-          <w:instrText xml:space="preserve"> PAGEREF _Toc236349591 \h </w:instrText>
+          <w:instrText xml:space="preserve"> PAGEREF _Toc236915118 \h </w:instrText>
         </w:r>
         <w:r>
           <w:rPr>
@@ -3497,7 +3495,7 @@
             <w:noProof/>
             <w:webHidden/>
           </w:rPr>
-          <w:t>18</w:t>
+          <w:t>17</w:t>
         </w:r>
         <w:r>
           <w:rPr>
@@ -3521,7 +3519,7 @@
           <w:lang w:val="fr-FR" w:eastAsia="fr-FR"/>
         </w:rPr>
       </w:pPr>
-      <w:hyperlink w:anchor="_Toc236349592" w:history="1">
+      <w:hyperlink w:anchor="_Toc236915119" w:history="1">
         <w:r>
           <w:rPr>
             <w:rStyle w:val="Lienhypertexte"/>
@@ -3553,7 +3551,7 @@
             <w:noProof/>
             <w:webHidden/>
           </w:rPr>
-          <w:instrText xml:space="preserve"> PAGEREF _Toc236349592 \h </w:instrText>
+          <w:instrText xml:space="preserve"> PAGEREF _Toc236915119 \h </w:instrText>
         </w:r>
         <w:r>
           <w:rPr>
@@ -3576,7 +3574,7 @@
             <w:noProof/>
             <w:webHidden/>
           </w:rPr>
-          <w:t>19</w:t>
+          <w:t>18</w:t>
         </w:r>
         <w:r>
           <w:rPr>
@@ -3600,7 +3598,7 @@
           <w:lang w:val="fr-FR" w:eastAsia="fr-FR"/>
         </w:rPr>
       </w:pPr>
-      <w:hyperlink w:anchor="_Toc236349593" w:history="1">
+      <w:hyperlink w:anchor="_Toc236915120" w:history="1">
         <w:r>
           <w:rPr>
             <w:rStyle w:val="Lienhypertexte"/>
@@ -3632,7 +3630,7 @@
             <w:noProof/>
             <w:webHidden/>
           </w:rPr>
-          <w:instrText xml:space="preserve"> PAGEREF _Toc236349593 \h </w:instrText>
+          <w:instrText xml:space="preserve"> PAGEREF _Toc236915120 \h </w:instrText>
         </w:r>
         <w:r>
           <w:rPr>
@@ -3679,7 +3677,7 @@
           <w:lang w:val="fr-FR" w:eastAsia="fr-FR"/>
         </w:rPr>
       </w:pPr>
-      <w:hyperlink w:anchor="_Toc236349594" w:history="1">
+      <w:hyperlink w:anchor="_Toc236915121" w:history="1">
         <w:r>
           <w:rPr>
             <w:rStyle w:val="Lienhypertexte"/>
@@ -3711,7 +3709,7 @@
             <w:noProof/>
             <w:webHidden/>
           </w:rPr>
-          <w:instrText xml:space="preserve"> PAGEREF _Toc236349594 \h </w:instrText>
+          <w:instrText xml:space="preserve"> PAGEREF _Toc236915121 \h </w:instrText>
         </w:r>
         <w:r>
           <w:rPr>
@@ -3734,7 +3732,7 @@
             <w:noProof/>
             <w:webHidden/>
           </w:rPr>
-          <w:t>23</w:t>
+          <w:t>22</w:t>
         </w:r>
         <w:r>
           <w:rPr>
@@ -3758,7 +3756,7 @@
           <w:lang w:val="fr-FR" w:eastAsia="fr-FR"/>
         </w:rPr>
       </w:pPr>
-      <w:hyperlink w:anchor="_Toc236349595" w:history="1">
+      <w:hyperlink w:anchor="_Toc236915122" w:history="1">
         <w:r>
           <w:rPr>
             <w:rStyle w:val="Lienhypertexte"/>
@@ -3790,7 +3788,7 @@
             <w:noProof/>
             <w:webHidden/>
           </w:rPr>
-          <w:instrText xml:space="preserve"> PAGEREF _Toc236349595 \h </w:instrText>
+          <w:instrText xml:space="preserve"> PAGEREF _Toc236915122 \h </w:instrText>
         </w:r>
         <w:r>
           <w:rPr>
@@ -3813,7 +3811,7 @@
             <w:noProof/>
             <w:webHidden/>
           </w:rPr>
-          <w:t>24</w:t>
+          <w:t>23</w:t>
         </w:r>
         <w:r>
           <w:rPr>
@@ -3837,7 +3835,7 @@
           <w:lang w:val="fr-FR" w:eastAsia="fr-FR"/>
         </w:rPr>
       </w:pPr>
-      <w:hyperlink w:anchor="_Toc236349596" w:history="1">
+      <w:hyperlink w:anchor="_Toc236915123" w:history="1">
         <w:r>
           <w:rPr>
             <w:rStyle w:val="Lienhypertexte"/>
@@ -3869,7 +3867,7 @@
             <w:noProof/>
             <w:webHidden/>
           </w:rPr>
-          <w:instrText xml:space="preserve"> PAGEREF _Toc236349596 \h </w:instrText>
+          <w:instrText xml:space="preserve"> PAGEREF _Toc236915123 \h </w:instrText>
         </w:r>
         <w:r>
           <w:rPr>
@@ -3916,7 +3914,7 @@
           <w:lang w:val="fr-FR" w:eastAsia="fr-FR"/>
         </w:rPr>
       </w:pPr>
-      <w:hyperlink w:anchor="_Toc236349597" w:history="1">
+      <w:hyperlink w:anchor="_Toc236915124" w:history="1">
         <w:r>
           <w:rPr>
             <w:rStyle w:val="Lienhypertexte"/>
@@ -3948,7 +3946,7 @@
             <w:noProof/>
             <w:webHidden/>
           </w:rPr>
-          <w:instrText xml:space="preserve"> PAGEREF _Toc236349597 \h </w:instrText>
+          <w:instrText xml:space="preserve"> PAGEREF _Toc236915124 \h </w:instrText>
         </w:r>
         <w:r>
           <w:rPr>
@@ -3995,7 +3993,7 @@
           <w:lang w:val="fr-FR" w:eastAsia="fr-FR"/>
         </w:rPr>
       </w:pPr>
-      <w:hyperlink w:anchor="_Toc236349598" w:history="1">
+      <w:hyperlink w:anchor="_Toc236915125" w:history="1">
         <w:r>
           <w:rPr>
             <w:rStyle w:val="Lienhypertexte"/>
@@ -4027,7 +4025,7 @@
             <w:noProof/>
             <w:webHidden/>
           </w:rPr>
-          <w:instrText xml:space="preserve"> PAGEREF _Toc236349598 \h </w:instrText>
+          <w:instrText xml:space="preserve"> PAGEREF _Toc236915125 \h </w:instrText>
         </w:r>
         <w:r>
           <w:rPr>
@@ -4074,7 +4072,7 @@
           <w:lang w:val="fr-FR" w:eastAsia="fr-FR"/>
         </w:rPr>
       </w:pPr>
-      <w:hyperlink w:anchor="_Toc236349599" w:history="1">
+      <w:hyperlink w:anchor="_Toc236915126" w:history="1">
         <w:r>
           <w:rPr>
             <w:rStyle w:val="Lienhypertexte"/>
@@ -4105,7 +4103,7 @@
             <w:noProof/>
             <w:webHidden/>
           </w:rPr>
-          <w:instrText xml:space="preserve"> PAGEREF _Toc236349599 \h </w:instrText>
+          <w:instrText xml:space="preserve"> PAGEREF _Toc236915126 \h </w:instrText>
         </w:r>
         <w:r>
           <w:rPr>
@@ -4152,7 +4150,7 @@
           <w:lang w:val="fr-FR" w:eastAsia="fr-FR"/>
         </w:rPr>
       </w:pPr>
-      <w:hyperlink w:anchor="_Toc236349600" w:history="1">
+      <w:hyperlink w:anchor="_Toc236915127" w:history="1">
         <w:r>
           <w:rPr>
             <w:rStyle w:val="Lienhypertexte"/>
@@ -4184,7 +4182,7 @@
             <w:noProof/>
             <w:webHidden/>
           </w:rPr>
-          <w:instrText xml:space="preserve"> PAGEREF _Toc236349600 \h </w:instrText>
+          <w:instrText xml:space="preserve"> PAGEREF _Toc236915127 \h </w:instrText>
         </w:r>
         <w:r>
           <w:rPr>
@@ -4231,7 +4229,7 @@
           <w:lang w:val="fr-FR" w:eastAsia="fr-FR"/>
         </w:rPr>
       </w:pPr>
-      <w:hyperlink w:anchor="_Toc236349601" w:history="1">
+      <w:hyperlink w:anchor="_Toc236915128" w:history="1">
         <w:r>
           <w:rPr>
             <w:rStyle w:val="Lienhypertexte"/>
@@ -4262,7 +4260,7 @@
             <w:noProof/>
             <w:webHidden/>
           </w:rPr>
-          <w:instrText xml:space="preserve"> PAGEREF _Toc236349601 \h </w:instrText>
+          <w:instrText xml:space="preserve"> PAGEREF _Toc236915128 \h </w:instrText>
         </w:r>
         <w:r>
           <w:rPr>
@@ -4309,7 +4307,7 @@
           <w:lang w:val="fr-FR" w:eastAsia="fr-FR"/>
         </w:rPr>
       </w:pPr>
-      <w:hyperlink w:anchor="_Toc236349602" w:history="1">
+      <w:hyperlink w:anchor="_Toc236915129" w:history="1">
         <w:r>
           <w:rPr>
             <w:rStyle w:val="Lienhypertexte"/>
@@ -4341,7 +4339,7 @@
             <w:noProof/>
             <w:webHidden/>
           </w:rPr>
-          <w:instrText xml:space="preserve"> PAGEREF _Toc236349602 \h </w:instrText>
+          <w:instrText xml:space="preserve"> PAGEREF _Toc236915129 \h </w:instrText>
         </w:r>
         <w:r>
           <w:rPr>
@@ -4388,7 +4386,7 @@
           <w:lang w:val="fr-FR" w:eastAsia="fr-FR"/>
         </w:rPr>
       </w:pPr>
-      <w:hyperlink w:anchor="_Toc236349603" w:history="1">
+      <w:hyperlink w:anchor="_Toc236915130" w:history="1">
         <w:r>
           <w:rPr>
             <w:rStyle w:val="Lienhypertexte"/>
@@ -4420,7 +4418,7 @@
             <w:noProof/>
             <w:webHidden/>
           </w:rPr>
-          <w:instrText xml:space="preserve"> PAGEREF _Toc236349603 \h </w:instrText>
+          <w:instrText xml:space="preserve"> PAGEREF _Toc236915130 \h </w:instrText>
         </w:r>
         <w:r>
           <w:rPr>
@@ -4467,7 +4465,7 @@
           <w:lang w:val="fr-FR" w:eastAsia="fr-FR"/>
         </w:rPr>
       </w:pPr>
-      <w:hyperlink w:anchor="_Toc236349604" w:history="1">
+      <w:hyperlink w:anchor="_Toc236915131" w:history="1">
         <w:r>
           <w:rPr>
             <w:rStyle w:val="Lienhypertexte"/>
@@ -4499,7 +4497,7 @@
             <w:noProof/>
             <w:webHidden/>
           </w:rPr>
-          <w:instrText xml:space="preserve"> PAGEREF _Toc236349604 \h </w:instrText>
+          <w:instrText xml:space="preserve"> PAGEREF _Toc236915131 \h </w:instrText>
         </w:r>
         <w:r>
           <w:rPr>
@@ -4546,7 +4544,7 @@
           <w:lang w:val="fr-FR" w:eastAsia="fr-FR"/>
         </w:rPr>
       </w:pPr>
-      <w:hyperlink w:anchor="_Toc236349605" w:history="1">
+      <w:hyperlink w:anchor="_Toc236915132" w:history="1">
         <w:r>
           <w:rPr>
             <w:rStyle w:val="Lienhypertexte"/>
@@ -4578,7 +4576,7 @@
             <w:noProof/>
             <w:webHidden/>
           </w:rPr>
-          <w:instrText xml:space="preserve"> PAGEREF _Toc236349605 \h </w:instrText>
+          <w:instrText xml:space="preserve"> PAGEREF _Toc236915132 \h </w:instrText>
         </w:r>
         <w:r>
           <w:rPr>
@@ -4625,7 +4623,7 @@
           <w:lang w:val="fr-FR" w:eastAsia="fr-FR"/>
         </w:rPr>
       </w:pPr>
-      <w:hyperlink w:anchor="_Toc236349606" w:history="1">
+      <w:hyperlink w:anchor="_Toc236915133" w:history="1">
         <w:r>
           <w:rPr>
             <w:rStyle w:val="Lienhypertexte"/>
@@ -4657,7 +4655,7 @@
             <w:noProof/>
             <w:webHidden/>
           </w:rPr>
-          <w:instrText xml:space="preserve"> PAGEREF _Toc236349606 \h </w:instrText>
+          <w:instrText xml:space="preserve"> PAGEREF _Toc236915133 \h </w:instrText>
         </w:r>
         <w:r>
           <w:rPr>
@@ -4704,7 +4702,7 @@
           <w:lang w:val="fr-FR" w:eastAsia="fr-FR"/>
         </w:rPr>
       </w:pPr>
-      <w:hyperlink w:anchor="_Toc236349607" w:history="1">
+      <w:hyperlink w:anchor="_Toc236915134" w:history="1">
         <w:r>
           <w:rPr>
             <w:rStyle w:val="Lienhypertexte"/>
@@ -4736,7 +4734,7 @@
             <w:noProof/>
             <w:webHidden/>
           </w:rPr>
-          <w:instrText xml:space="preserve"> PAGEREF _Toc236349607 \h </w:instrText>
+          <w:instrText xml:space="preserve"> PAGEREF _Toc236915134 \h </w:instrText>
         </w:r>
         <w:r>
           <w:rPr>
@@ -4783,7 +4781,7 @@
           <w:lang w:val="fr-FR" w:eastAsia="fr-FR"/>
         </w:rPr>
       </w:pPr>
-      <w:hyperlink w:anchor="_Toc236349608" w:history="1">
+      <w:hyperlink w:anchor="_Toc236915135" w:history="1">
         <w:r>
           <w:rPr>
             <w:rStyle w:val="Lienhypertexte"/>
@@ -4815,7 +4813,7 @@
             <w:noProof/>
             <w:webHidden/>
           </w:rPr>
-          <w:instrText xml:space="preserve"> PAGEREF _Toc236349608 \h </w:instrText>
+          <w:instrText xml:space="preserve"> PAGEREF _Toc236915135 \h </w:instrText>
         </w:r>
         <w:r>
           <w:rPr>
@@ -4862,7 +4860,7 @@
           <w:lang w:val="fr-FR" w:eastAsia="fr-FR"/>
         </w:rPr>
       </w:pPr>
-      <w:hyperlink w:anchor="_Toc236349609" w:history="1">
+      <w:hyperlink w:anchor="_Toc236915136" w:history="1">
         <w:r>
           <w:rPr>
             <w:rStyle w:val="Lienhypertexte"/>
@@ -4894,7 +4892,7 @@
             <w:noProof/>
             <w:webHidden/>
           </w:rPr>
-          <w:instrText xml:space="preserve"> PAGEREF _Toc236349609 \h </w:instrText>
+          <w:instrText xml:space="preserve"> PAGEREF _Toc236915136 \h </w:instrText>
         </w:r>
         <w:r>
           <w:rPr>
@@ -4941,7 +4939,7 @@
           <w:lang w:val="fr-FR" w:eastAsia="fr-FR"/>
         </w:rPr>
       </w:pPr>
-      <w:hyperlink w:anchor="_Toc236349610" w:history="1">
+      <w:hyperlink w:anchor="_Toc236915137" w:history="1">
         <w:r>
           <w:rPr>
             <w:rStyle w:val="Lienhypertexte"/>
@@ -4973,7 +4971,7 @@
             <w:noProof/>
             <w:webHidden/>
           </w:rPr>
-          <w:instrText xml:space="preserve"> PAGEREF _Toc236349610 \h </w:instrText>
+          <w:instrText xml:space="preserve"> PAGEREF _Toc236915137 \h </w:instrText>
         </w:r>
         <w:r>
           <w:rPr>
@@ -5020,7 +5018,7 @@
           <w:lang w:val="fr-FR" w:eastAsia="fr-FR"/>
         </w:rPr>
       </w:pPr>
-      <w:hyperlink w:anchor="_Toc236349611" w:history="1">
+      <w:hyperlink w:anchor="_Toc236915138" w:history="1">
         <w:r>
           <w:rPr>
             <w:rStyle w:val="Lienhypertexte"/>
@@ -5052,7 +5050,7 @@
             <w:noProof/>
             <w:webHidden/>
           </w:rPr>
-          <w:instrText xml:space="preserve"> PAGEREF _Toc236349611 \h </w:instrText>
+          <w:instrText xml:space="preserve"> PAGEREF _Toc236915138 \h </w:instrText>
         </w:r>
         <w:r>
           <w:rPr>
@@ -5099,7 +5097,7 @@
           <w:lang w:val="fr-FR" w:eastAsia="fr-FR"/>
         </w:rPr>
       </w:pPr>
-      <w:hyperlink w:anchor="_Toc236349612" w:history="1">
+      <w:hyperlink w:anchor="_Toc236915139" w:history="1">
         <w:r>
           <w:rPr>
             <w:rStyle w:val="Lienhypertexte"/>
@@ -5131,7 +5129,7 @@
             <w:noProof/>
             <w:webHidden/>
           </w:rPr>
-          <w:instrText xml:space="preserve"> PAGEREF _Toc236349612 \h </w:instrText>
+          <w:instrText xml:space="preserve"> PAGEREF _Toc236915139 \h </w:instrText>
         </w:r>
         <w:r>
           <w:rPr>
@@ -5178,7 +5176,7 @@
           <w:lang w:val="fr-FR" w:eastAsia="fr-FR"/>
         </w:rPr>
       </w:pPr>
-      <w:hyperlink w:anchor="_Toc236349613" w:history="1">
+      <w:hyperlink w:anchor="_Toc236915140" w:history="1">
         <w:r>
           <w:rPr>
             <w:rStyle w:val="Lienhypertexte"/>
@@ -5209,7 +5207,7 @@
             <w:noProof/>
             <w:webHidden/>
           </w:rPr>
-          <w:instrText xml:space="preserve"> PAGEREF _Toc236349613 \h </w:instrText>
+          <w:instrText xml:space="preserve"> PAGEREF _Toc236915140 \h </w:instrText>
         </w:r>
         <w:r>
           <w:rPr>
@@ -5280,15 +5278,23 @@
           <w:lang w:val="fr-FR"/>
         </w:rPr>
       </w:pPr>
-      <w:bookmarkStart w:id="3" w:name="_Toc236349562"/>
+      <w:bookmarkStart w:id="2" w:name="_Toc236915089"/>
       <w:r>
         <w:rPr>
           <w:lang w:val="fr-FR"/>
         </w:rPr>
         <w:lastRenderedPageBreak/>
-        <w:t>Introduction générale</w:t>
-      </w:r>
+        <w:t>Introduction g</w:t>
+      </w:r>
+      <w:bookmarkStart w:id="3" w:name="_GoBack"/>
       <w:bookmarkEnd w:id="3"/>
+      <w:r>
+        <w:rPr>
+          <w:lang w:val="fr-FR"/>
+        </w:rPr>
+        <w:t>énérale</w:t>
+      </w:r>
+      <w:bookmarkEnd w:id="2"/>
     </w:p>
     <w:p>
       <w:pPr>
@@ -5345,7 +5351,7 @@
           <w:rFonts w:asciiTheme="majorBidi" w:hAnsiTheme="majorBidi" w:cstheme="majorBidi"/>
           <w:lang w:val="fr-FR"/>
         </w:rPr>
-        <w:t>professionne</w:t>
+        <w:t>professionnel</w:t>
       </w:r>
       <w:r>
         <w:rPr>
@@ -5394,7 +5400,7 @@
           <w:lang w:val="fr-FR"/>
         </w:rPr>
       </w:pPr>
-      <w:bookmarkStart w:id="4" w:name="_Toc236349563"/>
+      <w:bookmarkStart w:id="4" w:name="_Toc236915090"/>
       <w:r>
         <w:rPr>
           <w:lang w:val="fr-FR"/>
@@ -5411,7 +5417,7 @@
           <w:lang w:val="fr-FR"/>
         </w:rPr>
       </w:pPr>
-      <w:bookmarkStart w:id="5" w:name="_Toc236349564"/>
+      <w:bookmarkStart w:id="5" w:name="_Toc236915091"/>
       <w:r>
         <w:rPr>
           <w:lang w:val="fr-FR"/>
@@ -5461,7 +5467,7 @@
           <w:lang w:val="fr-FR"/>
         </w:rPr>
       </w:pPr>
-      <w:bookmarkStart w:id="6" w:name="_Toc236349565"/>
+      <w:bookmarkStart w:id="6" w:name="_Toc236915092"/>
       <w:r>
         <w:rPr>
           <w:lang w:val="fr-FR"/>
@@ -5596,7 +5602,7 @@
           <w:lang w:val="fr-FR"/>
         </w:rPr>
       </w:pPr>
-      <w:bookmarkStart w:id="7" w:name="_Toc236349566"/>
+      <w:bookmarkStart w:id="7" w:name="_Toc236915093"/>
       <w:r>
         <w:rPr>
           <w:lang w:val="fr-FR"/>
@@ -5764,7 +5770,7 @@
           <w:lang w:val="fr-FR"/>
         </w:rPr>
       </w:pPr>
-      <w:bookmarkStart w:id="8" w:name="_Toc236349567"/>
+      <w:bookmarkStart w:id="8" w:name="_Toc236915094"/>
       <w:r>
         <w:rPr>
           <w:lang w:val="fr-FR"/>
@@ -5781,7 +5787,7 @@
           <w:lang w:val="fr-FR"/>
         </w:rPr>
       </w:pPr>
-      <w:bookmarkStart w:id="9" w:name="_Toc236349568"/>
+      <w:bookmarkStart w:id="9" w:name="_Toc236915095"/>
       <w:r>
         <w:rPr>
           <w:lang w:val="fr-FR"/>
@@ -5831,7 +5837,7 @@
           <w:lang w:val="fr-FR"/>
         </w:rPr>
       </w:pPr>
-      <w:bookmarkStart w:id="10" w:name="_Toc236349569"/>
+      <w:bookmarkStart w:id="10" w:name="_Toc236915096"/>
       <w:r>
         <w:rPr>
           <w:lang w:val="fr-FR"/>
@@ -5915,7 +5921,7 @@
           <w:lang w:val="fr-FR"/>
         </w:rPr>
       </w:pPr>
-      <w:bookmarkStart w:id="11" w:name="_Toc236349570"/>
+      <w:bookmarkStart w:id="11" w:name="_Toc236915097"/>
       <w:r>
         <w:rPr>
           <w:lang w:val="fr-FR"/>
@@ -5949,7 +5955,7 @@
           <w:color w:val="auto"/>
         </w:rPr>
       </w:pPr>
-      <w:bookmarkStart w:id="12" w:name="_Toc236349571"/>
+      <w:bookmarkStart w:id="12" w:name="_Toc236915098"/>
       <w:r>
         <w:rPr>
           <w:rFonts w:asciiTheme="majorBidi" w:hAnsiTheme="majorBidi"/>
@@ -6035,7 +6041,7 @@
           <w:color w:val="auto"/>
         </w:rPr>
       </w:pPr>
-      <w:bookmarkStart w:id="13" w:name="_Toc236349572"/>
+      <w:bookmarkStart w:id="13" w:name="_Toc236915099"/>
       <w:r>
         <w:rPr>
           <w:rFonts w:asciiTheme="majorBidi" w:hAnsiTheme="majorBidi"/>
@@ -6122,7 +6128,7 @@
           <w:color w:val="auto"/>
         </w:rPr>
       </w:pPr>
-      <w:bookmarkStart w:id="14" w:name="_Toc236349573"/>
+      <w:bookmarkStart w:id="14" w:name="_Toc236915100"/>
       <w:r>
         <w:rPr>
           <w:rFonts w:asciiTheme="majorBidi" w:hAnsiTheme="majorBidi"/>
@@ -6157,7 +6163,7 @@
           <w:color w:val="auto"/>
         </w:rPr>
       </w:pPr>
-      <w:bookmarkStart w:id="15" w:name="_Toc236349574"/>
+      <w:bookmarkStart w:id="15" w:name="_Toc236915101"/>
       <w:r>
         <w:rPr>
           <w:rFonts w:asciiTheme="majorBidi" w:hAnsiTheme="majorBidi"/>
@@ -6226,7 +6232,7 @@
           <w:color w:val="auto"/>
         </w:rPr>
       </w:pPr>
-      <w:bookmarkStart w:id="16" w:name="_Toc236349575"/>
+      <w:bookmarkStart w:id="16" w:name="_Toc236915102"/>
       <w:r>
         <w:rPr>
           <w:rFonts w:asciiTheme="majorBidi" w:hAnsiTheme="majorBidi"/>
@@ -6278,7 +6284,7 @@
           <w:color w:val="auto"/>
         </w:rPr>
       </w:pPr>
-      <w:bookmarkStart w:id="17" w:name="_Toc236349576"/>
+      <w:bookmarkStart w:id="17" w:name="_Toc236915103"/>
       <w:r>
         <w:rPr>
           <w:rFonts w:asciiTheme="majorBidi" w:hAnsiTheme="majorBidi"/>
@@ -6343,7 +6349,7 @@
       <w:pPr>
         <w:pStyle w:val="Titre2"/>
       </w:pPr>
-      <w:bookmarkStart w:id="18" w:name="_Toc236349577"/>
+      <w:bookmarkStart w:id="18" w:name="_Toc236915104"/>
       <w:r>
         <w:t>2.4 Besoins non fonctionnels</w:t>
       </w:r>
@@ -6473,7 +6479,7 @@
           <w:lang w:val="fr-FR"/>
         </w:rPr>
       </w:pPr>
-      <w:bookmarkStart w:id="19" w:name="_Toc236349578"/>
+      <w:bookmarkStart w:id="19" w:name="_Toc236915105"/>
       <w:r>
         <w:rPr>
           <w:lang w:val="fr-FR"/>
@@ -6490,7 +6496,7 @@
           <w:lang w:val="fr-FR"/>
         </w:rPr>
       </w:pPr>
-      <w:bookmarkStart w:id="20" w:name="_Toc236349579"/>
+      <w:bookmarkStart w:id="20" w:name="_Toc236915106"/>
       <w:r>
         <w:rPr>
           <w:lang w:val="fr-FR"/>
@@ -6619,7 +6625,7 @@
         <mc:AlternateContent>
           <mc:Choice Requires="wps">
             <w:drawing>
-              <wp:anchor distT="0" distB="0" distL="114300" distR="114300" simplePos="0" relativeHeight="251675648" behindDoc="0" locked="0" layoutInCell="1" allowOverlap="1" wp14:anchorId="44380CE4" wp14:editId="35537114">
+              <wp:anchor distT="0" distB="0" distL="114300" distR="114300" simplePos="0" relativeHeight="251677696" behindDoc="0" locked="0" layoutInCell="1" allowOverlap="1" wp14:anchorId="44380CE4" wp14:editId="35537114">
                 <wp:simplePos x="0" y="0"/>
                 <wp:positionH relativeFrom="column">
                   <wp:posOffset>4481830</wp:posOffset>
@@ -6685,7 +6691,7 @@
           </mc:Choice>
           <mc:Fallback>
             <w:pict>
-              <v:shapetype w14:anchorId="7EB2C202" id="_x0000_t38" coordsize="21600,21600" o:spt="38" o:oned="t" path="m,c@0,0@1,5400@1,10800@1,16200@2,21600,21600,21600e" filled="f">
+              <v:shapetype w14:anchorId="067D8A7E" id="_x0000_t38" coordsize="21600,21600" o:spt="38" o:oned="t" path="m,c@0,0@1,5400@1,10800@1,16200@2,21600,21600,21600e" filled="f">
                 <v:formulas>
                   <v:f eqn="mid #0 0"/>
                   <v:f eqn="val #0"/>
@@ -6697,7 +6703,7 @@
                 </v:handles>
                 <o:lock v:ext="edit" shapetype="t"/>
               </v:shapetype>
-              <v:shape id="Connecteur en arc 26" o:spid="_x0000_s1026" type="#_x0000_t38" style="position:absolute;margin-left:352.9pt;margin-top:224.95pt;width:26.3pt;height:54.5pt;flip:x y;z-index:251675648;visibility:visible;mso-wrap-style:square;mso-width-percent:0;mso-height-percent:0;mso-wrap-distance-left:9pt;mso-wrap-distance-top:0;mso-wrap-distance-right:9pt;mso-wrap-distance-bottom:0;mso-position-horizontal:absolute;mso-position-horizontal-relative:text;mso-position-vertical:absolute;mso-position-vertical-relative:text;mso-width-percent:0;mso-height-percent:0;mso-width-relative:margin;mso-height-relative:margin" o:gfxdata="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" adj="21232" strokecolor="#974706 [1609]" strokeweight="2pt">
+              <v:shape id="Connecteur en arc 26" o:spid="_x0000_s1026" type="#_x0000_t38" style="position:absolute;margin-left:352.9pt;margin-top:224.95pt;width:26.3pt;height:54.5pt;flip:x y;z-index:251677696;visibility:visible;mso-wrap-style:square;mso-width-percent:0;mso-height-percent:0;mso-wrap-distance-left:9pt;mso-wrap-distance-top:0;mso-wrap-distance-right:9pt;mso-wrap-distance-bottom:0;mso-position-horizontal:absolute;mso-position-horizontal-relative:text;mso-position-vertical:absolute;mso-position-vertical-relative:text;mso-width-percent:0;mso-height-percent:0;mso-width-relative:margin;mso-height-relative:margin" o:gfxdata="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" adj="21232" strokecolor="#974706 [1609]" strokeweight="2pt">
                 <v:stroke dashstyle="1 1" endarrow="block"/>
                 <v:shadow on="t" color="black" opacity="24903f" origin=",.5" offset="0,.55556mm"/>
               </v:shape>
@@ -6714,7 +6720,7 @@
         <mc:AlternateContent>
           <mc:Choice Requires="wps">
             <w:drawing>
-              <wp:anchor distT="0" distB="0" distL="114300" distR="114300" simplePos="0" relativeHeight="251642880" behindDoc="0" locked="0" layoutInCell="1" allowOverlap="1" wp14:anchorId="4EF3F1AF" wp14:editId="7F8B9B04">
+              <wp:anchor distT="0" distB="0" distL="114300" distR="114300" simplePos="0" relativeHeight="251640832" behindDoc="0" locked="0" layoutInCell="1" allowOverlap="1" wp14:anchorId="4EF3F1AF" wp14:editId="7F8B9B04">
                 <wp:simplePos x="0" y="0"/>
                 <wp:positionH relativeFrom="column">
                   <wp:posOffset>349885</wp:posOffset>
@@ -6769,11 +6775,11 @@
           </mc:Choice>
           <mc:Fallback>
             <w:pict>
-              <v:shapetype w14:anchorId="667D946B" id="_x0000_t32" coordsize="21600,21600" o:spt="32" o:oned="t" path="m,l21600,21600e" filled="f">
+              <v:shapetype w14:anchorId="33802EF7" id="_x0000_t32" coordsize="21600,21600" o:spt="32" o:oned="t" path="m,l21600,21600e" filled="f">
                 <v:path arrowok="t" fillok="f" o:connecttype="none"/>
                 <o:lock v:ext="edit" shapetype="t"/>
               </v:shapetype>
-              <v:shape id="Connecteur droit avec flèche 2" o:spid="_x0000_s1026" type="#_x0000_t32" style="position:absolute;margin-left:27.55pt;margin-top:138.6pt;width:0;height:14.2pt;z-index:251642880;visibility:visible;mso-wrap-style:square;mso-height-percent:0;mso-wrap-distance-left:9pt;mso-wrap-distance-top:0;mso-wrap-distance-right:9pt;mso-wrap-distance-bottom:0;mso-position-horizontal:absolute;mso-position-horizontal-relative:text;mso-position-vertical:absolute;mso-position-vertical-relative:text;mso-height-percent:0;mso-height-relative:margin" o:gfxdata="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" strokecolor="#4f81bd [3204]" strokeweight="2pt">
+              <v:shape id="Connecteur droit avec flèche 2" o:spid="_x0000_s1026" type="#_x0000_t32" style="position:absolute;margin-left:27.55pt;margin-top:138.6pt;width:0;height:14.2pt;z-index:251640832;visibility:visible;mso-wrap-style:square;mso-height-percent:0;mso-wrap-distance-left:9pt;mso-wrap-distance-top:0;mso-wrap-distance-right:9pt;mso-wrap-distance-bottom:0;mso-position-horizontal:absolute;mso-position-horizontal-relative:text;mso-position-vertical:absolute;mso-position-vertical-relative:text;mso-height-percent:0;mso-height-relative:margin" o:gfxdata="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" strokecolor="#4f81bd [3204]" strokeweight="2pt">
                 <v:stroke endarrow="block"/>
                 <v:shadow on="t" color="black" opacity="24903f" origin=",.5" offset="0,.55556mm"/>
               </v:shape>
@@ -6790,7 +6796,7 @@
         <mc:AlternateContent>
           <mc:Choice Requires="wps">
             <w:drawing>
-              <wp:anchor distT="0" distB="0" distL="114300" distR="114300" simplePos="0" relativeHeight="251655168" behindDoc="0" locked="0" layoutInCell="1" allowOverlap="1" wp14:anchorId="29C6DD7E" wp14:editId="4D2BFA1F">
+              <wp:anchor distT="0" distB="0" distL="114300" distR="114300" simplePos="0" relativeHeight="251657216" behindDoc="0" locked="0" layoutInCell="1" allowOverlap="1" wp14:anchorId="29C6DD7E" wp14:editId="4D2BFA1F">
                 <wp:simplePos x="0" y="0"/>
                 <wp:positionH relativeFrom="column">
                   <wp:posOffset>2520950</wp:posOffset>
@@ -6845,7 +6851,7 @@
           </mc:Choice>
           <mc:Fallback>
             <w:pict>
-              <v:shape w14:anchorId="519BFBEA" id="Connecteur droit avec flèche 12" o:spid="_x0000_s1026" type="#_x0000_t32" style="position:absolute;margin-left:198.5pt;margin-top:139.05pt;width:0;height:14.2pt;z-index:251655168;visibility:visible;mso-wrap-style:square;mso-height-percent:0;mso-wrap-distance-left:9pt;mso-wrap-distance-top:0;mso-wrap-distance-right:9pt;mso-wrap-distance-bottom:0;mso-position-horizontal:absolute;mso-position-horizontal-relative:text;mso-position-vertical:absolute;mso-position-vertical-relative:text;mso-height-percent:0;mso-height-relative:margin" o:gfxdata="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" strokecolor="#4f81bd [3204]" strokeweight="2pt">
+              <v:shape w14:anchorId="39ACCDF4" id="Connecteur droit avec flèche 12" o:spid="_x0000_s1026" type="#_x0000_t32" style="position:absolute;margin-left:198.5pt;margin-top:139.05pt;width:0;height:14.2pt;z-index:251657216;visibility:visible;mso-wrap-style:square;mso-height-percent:0;mso-wrap-distance-left:9pt;mso-wrap-distance-top:0;mso-wrap-distance-right:9pt;mso-wrap-distance-bottom:0;mso-position-horizontal:absolute;mso-position-horizontal-relative:text;mso-position-vertical:absolute;mso-position-vertical-relative:text;mso-height-percent:0;mso-height-relative:margin" o:gfxdata="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" strokecolor="#4f81bd [3204]" strokeweight="2pt">
                 <v:stroke endarrow="block"/>
                 <v:shadow on="t" color="black" opacity="24903f" origin=",.5" offset="0,.55556mm"/>
               </v:shape>
@@ -6862,7 +6868,7 @@
         <mc:AlternateContent>
           <mc:Choice Requires="wps">
             <w:drawing>
-              <wp:anchor distT="0" distB="0" distL="114300" distR="114300" simplePos="0" relativeHeight="251659264" behindDoc="0" locked="0" layoutInCell="1" allowOverlap="1" wp14:anchorId="2B275ED0" wp14:editId="206D2C74">
+              <wp:anchor distT="0" distB="0" distL="114300" distR="114300" simplePos="0" relativeHeight="251661312" behindDoc="0" locked="0" layoutInCell="1" allowOverlap="1" wp14:anchorId="2B275ED0" wp14:editId="206D2C74">
                 <wp:simplePos x="0" y="0"/>
                 <wp:positionH relativeFrom="column">
                   <wp:posOffset>356235</wp:posOffset>
@@ -6917,7 +6923,7 @@
           </mc:Choice>
           <mc:Fallback>
             <w:pict>
-              <v:shape w14:anchorId="517A3277" id="Connecteur droit avec flèche 21" o:spid="_x0000_s1026" type="#_x0000_t32" style="position:absolute;margin-left:28.05pt;margin-top:226.6pt;width:0;height:14.25pt;z-index:251659264;visibility:visible;mso-wrap-style:square;mso-height-percent:0;mso-wrap-distance-left:9pt;mso-wrap-distance-top:0;mso-wrap-distance-right:9pt;mso-wrap-distance-bottom:0;mso-position-horizontal:absolute;mso-position-horizontal-relative:text;mso-position-vertical:absolute;mso-position-vertical-relative:text;mso-height-percent:0;mso-height-relative:margin" o:gfxdata="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" strokecolor="#4f81bd [3204]" strokeweight="2pt">
+              <v:shape w14:anchorId="006ABA56" id="Connecteur droit avec flèche 21" o:spid="_x0000_s1026" type="#_x0000_t32" style="position:absolute;margin-left:28.05pt;margin-top:226.6pt;width:0;height:14.25pt;z-index:251661312;visibility:visible;mso-wrap-style:square;mso-height-percent:0;mso-wrap-distance-left:9pt;mso-wrap-distance-top:0;mso-wrap-distance-right:9pt;mso-wrap-distance-bottom:0;mso-position-horizontal:absolute;mso-position-horizontal-relative:text;mso-position-vertical:absolute;mso-position-vertical-relative:text;mso-height-percent:0;mso-height-relative:margin" o:gfxdata="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" strokecolor="#4f81bd [3204]" strokeweight="2pt">
                 <v:stroke endarrow="block"/>
                 <v:shadow on="t" color="black" opacity="24903f" origin=",.5" offset="0,.55556mm"/>
               </v:shape>
@@ -6934,7 +6940,7 @@
         <mc:AlternateContent>
           <mc:Choice Requires="wps">
             <w:drawing>
-              <wp:anchor distT="0" distB="0" distL="114300" distR="114300" simplePos="0" relativeHeight="251663360" behindDoc="0" locked="0" layoutInCell="1" allowOverlap="1" wp14:anchorId="174F1E48" wp14:editId="51497637">
+              <wp:anchor distT="0" distB="0" distL="114300" distR="114300" simplePos="0" relativeHeight="251665408" behindDoc="0" locked="0" layoutInCell="1" allowOverlap="1" wp14:anchorId="174F1E48" wp14:editId="51497637">
                 <wp:simplePos x="0" y="0"/>
                 <wp:positionH relativeFrom="column">
                   <wp:posOffset>1679575</wp:posOffset>
@@ -6989,7 +6995,7 @@
           </mc:Choice>
           <mc:Fallback>
             <w:pict>
-              <v:shape w14:anchorId="0094A0A5" id="Connecteur droit avec flèche 22" o:spid="_x0000_s1026" type="#_x0000_t32" style="position:absolute;margin-left:132.25pt;margin-top:308.95pt;width:0;height:14.25pt;z-index:251663360;visibility:visible;mso-wrap-style:square;mso-height-percent:0;mso-wrap-distance-left:9pt;mso-wrap-distance-top:0;mso-wrap-distance-right:9pt;mso-wrap-distance-bottom:0;mso-position-horizontal:absolute;mso-position-horizontal-relative:text;mso-position-vertical:absolute;mso-position-vertical-relative:text;mso-height-percent:0;mso-height-relative:margin" o:gfxdata="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" strokecolor="#4f81bd [3204]" strokeweight="2pt">
+              <v:shape w14:anchorId="43F51C76" id="Connecteur droit avec flèche 22" o:spid="_x0000_s1026" type="#_x0000_t32" style="position:absolute;margin-left:132.25pt;margin-top:308.95pt;width:0;height:14.25pt;z-index:251665408;visibility:visible;mso-wrap-style:square;mso-height-percent:0;mso-wrap-distance-left:9pt;mso-wrap-distance-top:0;mso-wrap-distance-right:9pt;mso-wrap-distance-bottom:0;mso-position-horizontal:absolute;mso-position-horizontal-relative:text;mso-position-vertical:absolute;mso-position-vertical-relative:text;mso-height-percent:0;mso-height-relative:margin" o:gfxdata="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" strokecolor="#4f81bd [3204]" strokeweight="2pt">
                 <v:stroke endarrow="block"/>
                 <v:shadow on="t" color="black" opacity="24903f" origin=",.5" offset="0,.55556mm"/>
               </v:shape>
@@ -7006,7 +7012,7 @@
         <mc:AlternateContent>
           <mc:Choice Requires="wps">
             <w:drawing>
-              <wp:anchor distT="0" distB="0" distL="114300" distR="114300" simplePos="0" relativeHeight="251667456" behindDoc="0" locked="0" layoutInCell="1" allowOverlap="1" wp14:anchorId="0A48EF74" wp14:editId="2B16F5F5">
+              <wp:anchor distT="0" distB="0" distL="114300" distR="114300" simplePos="0" relativeHeight="251669504" behindDoc="0" locked="0" layoutInCell="1" allowOverlap="1" wp14:anchorId="0A48EF74" wp14:editId="2B16F5F5">
                 <wp:simplePos x="0" y="0"/>
                 <wp:positionH relativeFrom="column">
                   <wp:posOffset>2553970</wp:posOffset>
@@ -7061,7 +7067,7 @@
           </mc:Choice>
           <mc:Fallback>
             <w:pict>
-              <v:shape w14:anchorId="10F23753" id="Connecteur droit avec flèche 23" o:spid="_x0000_s1026" type="#_x0000_t32" style="position:absolute;margin-left:201.1pt;margin-top:226.55pt;width:0;height:14.25pt;z-index:251667456;visibility:visible;mso-wrap-style:square;mso-height-percent:0;mso-wrap-distance-left:9pt;mso-wrap-distance-top:0;mso-wrap-distance-right:9pt;mso-wrap-distance-bottom:0;mso-position-horizontal:absolute;mso-position-horizontal-relative:text;mso-position-vertical:absolute;mso-position-vertical-relative:text;mso-height-percent:0;mso-height-relative:margin" o:gfxdata="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" strokecolor="#4f81bd [3204]" strokeweight="2pt">
+              <v:shape w14:anchorId="14B77D81" id="Connecteur droit avec flèche 23" o:spid="_x0000_s1026" type="#_x0000_t32" style="position:absolute;margin-left:201.1pt;margin-top:226.55pt;width:0;height:14.25pt;z-index:251669504;visibility:visible;mso-wrap-style:square;mso-height-percent:0;mso-wrap-distance-left:9pt;mso-wrap-distance-top:0;mso-wrap-distance-right:9pt;mso-wrap-distance-bottom:0;mso-position-horizontal:absolute;mso-position-horizontal-relative:text;mso-position-vertical:absolute;mso-position-vertical-relative:text;mso-height-percent:0;mso-height-relative:margin" o:gfxdata="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" strokecolor="#4f81bd [3204]" strokeweight="2pt">
                 <v:stroke endarrow="block"/>
                 <v:shadow on="t" color="black" opacity="24903f" origin=",.5" offset="0,.55556mm"/>
               </v:shape>
@@ -7078,7 +7084,7 @@
         <mc:AlternateContent>
           <mc:Choice Requires="wps">
             <w:drawing>
-              <wp:anchor distT="0" distB="0" distL="114300" distR="114300" simplePos="0" relativeHeight="251671552" behindDoc="0" locked="0" layoutInCell="1" allowOverlap="1" wp14:anchorId="2AE6700D" wp14:editId="65657777">
+              <wp:anchor distT="0" distB="0" distL="114300" distR="114300" simplePos="0" relativeHeight="251673600" behindDoc="0" locked="0" layoutInCell="1" allowOverlap="1" wp14:anchorId="2AE6700D" wp14:editId="65657777">
                 <wp:simplePos x="0" y="0"/>
                 <wp:positionH relativeFrom="column">
                   <wp:posOffset>3409315</wp:posOffset>
@@ -7133,7 +7139,7 @@
           </mc:Choice>
           <mc:Fallback>
             <w:pict>
-              <v:shape w14:anchorId="1FFAB75C" id="Connecteur droit avec flèche 25" o:spid="_x0000_s1026" type="#_x0000_t32" style="position:absolute;margin-left:268.45pt;margin-top:108pt;width:29.55pt;height:0;z-index:251671552;visibility:visible;mso-wrap-style:square;mso-width-percent:0;mso-wrap-distance-left:9pt;mso-wrap-distance-top:0;mso-wrap-distance-right:9pt;mso-wrap-distance-bottom:0;mso-position-horizontal:absolute;mso-position-horizontal-relative:text;mso-position-vertical:absolute;mso-position-vertical-relative:text;mso-width-percent:0;mso-width-relative:margin" o:gfxdata="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" strokecolor="#4f81bd [3204]" strokeweight="2pt">
+              <v:shape w14:anchorId="61479BB1" id="Connecteur droit avec flèche 25" o:spid="_x0000_s1026" type="#_x0000_t32" style="position:absolute;margin-left:268.45pt;margin-top:108pt;width:29.55pt;height:0;z-index:251673600;visibility:visible;mso-wrap-style:square;mso-width-percent:0;mso-wrap-distance-left:9pt;mso-wrap-distance-top:0;mso-wrap-distance-right:9pt;mso-wrap-distance-bottom:0;mso-position-horizontal:absolute;mso-position-horizontal-relative:text;mso-position-vertical:absolute;mso-position-vertical-relative:text;mso-width-percent:0;mso-width-relative:margin" o:gfxdata="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" strokecolor="#4f81bd [3204]" strokeweight="2pt">
                 <v:stroke endarrow="block"/>
                 <v:shadow on="t" color="black" opacity="24903f" origin=",.5" offset="0,.55556mm"/>
               </v:shape>
@@ -7148,7 +7154,7 @@
           <w:lang w:val="fr-FR" w:eastAsia="fr-FR"/>
         </w:rPr>
         <w:drawing>
-          <wp:anchor distT="0" distB="0" distL="114300" distR="114300" simplePos="0" relativeHeight="251638784" behindDoc="0" locked="0" layoutInCell="1" allowOverlap="1" wp14:anchorId="75204633" wp14:editId="72321919">
+          <wp:anchor distT="0" distB="0" distL="114300" distR="114300" simplePos="0" relativeHeight="251636736" behindDoc="0" locked="0" layoutInCell="1" allowOverlap="1" wp14:anchorId="75204633" wp14:editId="72321919">
             <wp:simplePos x="0" y="0"/>
             <wp:positionH relativeFrom="column">
               <wp:posOffset>-55387</wp:posOffset>
@@ -7184,7 +7190,7 @@
         <mc:AlternateContent>
           <mc:Choice Requires="wps">
             <w:drawing>
-              <wp:anchor distT="0" distB="0" distL="114300" distR="114300" simplePos="0" relativeHeight="251679744" behindDoc="0" locked="0" layoutInCell="1" allowOverlap="1" wp14:anchorId="64146558" wp14:editId="7D80C080">
+              <wp:anchor distT="0" distB="0" distL="114300" distR="114300" simplePos="0" relativeHeight="251681792" behindDoc="0" locked="0" layoutInCell="1" allowOverlap="1" wp14:anchorId="64146558" wp14:editId="7D80C080">
                 <wp:simplePos x="0" y="0"/>
                 <wp:positionH relativeFrom="column">
                   <wp:posOffset>-464820</wp:posOffset>
@@ -7286,7 +7292,7 @@
           </mc:Choice>
           <mc:Fallback>
             <w:pict>
-              <v:shape w14:anchorId="64146558" id="Zone de texte 27" o:spid="_x0000_s1027" type="#_x0000_t202" style="position:absolute;left:0;text-align:left;margin-left:-36.6pt;margin-top:413.6pt;width:485.25pt;height:.05pt;z-index:251679744;visibility:visible;mso-wrap-style:square;mso-wrap-distance-left:9pt;mso-wrap-distance-top:0;mso-wrap-distance-right:9pt;mso-wrap-distance-bottom:0;mso-position-horizontal:absolute;mso-position-horizontal-relative:text;mso-position-vertical:absolute;mso-position-vertical-relative:text;v-text-anchor:top" o:gfxdata="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" stroked="f">
+              <v:shape w14:anchorId="64146558" id="Zone de texte 27" o:spid="_x0000_s1027" type="#_x0000_t202" style="position:absolute;left:0;text-align:left;margin-left:-36.6pt;margin-top:413.6pt;width:485.25pt;height:.05pt;z-index:251681792;visibility:visible;mso-wrap-style:square;mso-wrap-distance-left:9pt;mso-wrap-distance-top:0;mso-wrap-distance-right:9pt;mso-wrap-distance-bottom:0;mso-position-horizontal:absolute;mso-position-horizontal-relative:text;mso-position-vertical:absolute;mso-position-vertical-relative:text;v-text-anchor:top" o:gfxdata="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" stroked="f">
                 <v:textbox style="mso-fit-shape-to-text:t" inset="0,0,0,0">
                   <w:txbxContent>
                     <w:p>
@@ -7363,7 +7369,7 @@
           <w:lang w:val="fr-FR"/>
         </w:rPr>
       </w:pPr>
-      <w:bookmarkStart w:id="21" w:name="_Toc236349580"/>
+      <w:bookmarkStart w:id="21" w:name="_Toc236915107"/>
       <w:r>
         <w:rPr>
           <w:lang w:val="fr-FR"/>
@@ -7887,7 +7893,7 @@
           <w:lang w:val="fr-FR"/>
         </w:rPr>
       </w:pPr>
-      <w:bookmarkStart w:id="22" w:name="_Toc236349581"/>
+      <w:bookmarkStart w:id="22" w:name="_Toc236915108"/>
       <w:r>
         <w:rPr>
           <w:lang w:val="fr-FR"/>
@@ -8528,7 +8534,7 @@
           <w:lang w:val="fr-FR"/>
         </w:rPr>
       </w:pPr>
-      <w:bookmarkStart w:id="23" w:name="_Toc236349582"/>
+      <w:bookmarkStart w:id="23" w:name="_Toc236915109"/>
       <w:r>
         <w:rPr>
           <w:lang w:val="fr-FR"/>
@@ -8915,7 +8921,7 @@
           <w:lang w:val="fr-FR"/>
         </w:rPr>
       </w:pPr>
-      <w:bookmarkStart w:id="24" w:name="_Toc236349583"/>
+      <w:bookmarkStart w:id="24" w:name="_Toc236915110"/>
       <w:r>
         <w:rPr>
           <w:lang w:val="fr-FR"/>
@@ -9001,7 +9007,7 @@
           <w:lang w:val="fr-FR"/>
         </w:rPr>
       </w:pPr>
-      <w:bookmarkStart w:id="25" w:name="_Toc236349584"/>
+      <w:bookmarkStart w:id="25" w:name="_Toc236915111"/>
       <w:r>
         <w:rPr>
           <w:rFonts w:asciiTheme="majorBidi" w:hAnsiTheme="majorBidi"/>
@@ -9628,7 +9634,7 @@
           <w:lang w:val="fr-FR"/>
         </w:rPr>
       </w:pPr>
-      <w:bookmarkStart w:id="26" w:name="_Toc236349585"/>
+      <w:bookmarkStart w:id="26" w:name="_Toc236915112"/>
       <w:r>
         <w:rPr>
           <w:lang w:val="fr-FR"/>
@@ -9645,7 +9651,7 @@
           <w:lang w:val="fr-FR"/>
         </w:rPr>
       </w:pPr>
-      <w:bookmarkStart w:id="27" w:name="_Toc236349586"/>
+      <w:bookmarkStart w:id="27" w:name="_Toc236915113"/>
       <w:r>
         <w:rPr>
           <w:lang w:val="fr-FR"/>
@@ -9678,7 +9684,7 @@
           <w:lang w:val="fr-FR"/>
         </w:rPr>
       </w:pPr>
-      <w:bookmarkStart w:id="28" w:name="_Toc236349587"/>
+      <w:bookmarkStart w:id="28" w:name="_Toc236915114"/>
       <w:r>
         <w:rPr>
           <w:lang w:val="fr-FR"/>
@@ -9736,11 +9742,10 @@
           <w:noProof/>
           <w:lang w:val="fr-FR" w:eastAsia="fr-FR"/>
         </w:rPr>
-        <w:lastRenderedPageBreak/>
         <w:drawing>
           <wp:inline distT="0" distB="0" distL="0" distR="0" wp14:anchorId="52629093" wp14:editId="2A514BC5">
-            <wp:extent cx="4715424" cy="3094990"/>
-            <wp:effectExtent l="0" t="0" r="9525" b="0"/>
+            <wp:extent cx="4715424" cy="2570847"/>
+            <wp:effectExtent l="0" t="0" r="0" b="1270"/>
             <wp:docPr id="6" name="Image 6"/>
             <wp:cNvGraphicFramePr>
               <a:graphicFrameLocks xmlns:a="http://schemas.openxmlformats.org/drawingml/2006/main" noChangeAspect="1"/>
@@ -9767,7 +9772,7 @@
                   <pic:spPr>
                     <a:xfrm>
                       <a:off x="0" y="0"/>
-                      <a:ext cx="4715424" cy="3094990"/>
+                      <a:ext cx="4715424" cy="2570847"/>
                     </a:xfrm>
                     <a:prstGeom prst="rect">
                       <a:avLst/>
@@ -9844,11 +9849,12 @@
           <w:lang w:val="fr-FR"/>
         </w:rPr>
       </w:pPr>
-      <w:bookmarkStart w:id="29" w:name="_Toc236349588"/>
-      <w:r>
-        <w:rPr>
-          <w:lang w:val="fr-FR"/>
-        </w:rPr>
+      <w:bookmarkStart w:id="29" w:name="_Toc236915115"/>
+      <w:r>
+        <w:rPr>
+          <w:lang w:val="fr-FR"/>
+        </w:rPr>
+        <w:lastRenderedPageBreak/>
         <w:t>4.3 Module Import de données</w:t>
       </w:r>
       <w:bookmarkEnd w:id="29"/>
@@ -10012,7 +10018,6 @@
                 <w:sz w:val="17"/>
                 <w:lang w:val="fr-FR"/>
               </w:rPr>
-              <w:lastRenderedPageBreak/>
               <w:t xml:space="preserve">    if "login" in reponse.url.lower():</w:t>
             </w:r>
           </w:p>
@@ -10101,9 +10106,10 @@
           <w:noProof/>
           <w:lang w:val="fr-FR" w:eastAsia="fr-FR"/>
         </w:rPr>
+        <w:lastRenderedPageBreak/>
         <w:drawing>
           <wp:inline distT="0" distB="0" distL="0" distR="0" wp14:anchorId="3F084C12" wp14:editId="3C5B1532">
-            <wp:extent cx="5760720" cy="3077210"/>
+            <wp:extent cx="5722059" cy="3077210"/>
             <wp:effectExtent l="0" t="0" r="0" b="8890"/>
             <wp:docPr id="8" name="Image 8"/>
             <wp:cNvGraphicFramePr>
@@ -10117,7 +10123,13 @@
                     <pic:cNvPicPr/>
                   </pic:nvPicPr>
                   <pic:blipFill>
-                    <a:blip r:embed="rId22"/>
+                    <a:blip r:embed="rId22">
+                      <a:extLst>
+                        <a:ext uri="{28A0092B-C50C-407E-A947-70E740481C1C}">
+                          <a14:useLocalDpi xmlns:a14="http://schemas.microsoft.com/office/drawing/2010/main" val="0"/>
+                        </a:ext>
+                      </a:extLst>
+                    </a:blip>
                     <a:stretch>
                       <a:fillRect/>
                     </a:stretch>
@@ -10125,7 +10137,7 @@
                   <pic:spPr>
                     <a:xfrm>
                       <a:off x="0" y="0"/>
-                      <a:ext cx="5760720" cy="3077210"/>
+                      <a:ext cx="5722059" cy="3077210"/>
                     </a:xfrm>
                     <a:prstGeom prst="rect">
                       <a:avLst/>
@@ -10202,7 +10214,7 @@
           <w:lang w:val="fr-FR"/>
         </w:rPr>
       </w:pPr>
-      <w:bookmarkStart w:id="30" w:name="_Toc236349589"/>
+      <w:bookmarkStart w:id="30" w:name="_Toc236915116"/>
       <w:r>
         <w:rPr>
           <w:lang w:val="fr-FR"/>
@@ -10242,11 +10254,10 @@
           <w:noProof/>
           <w:lang w:val="fr-FR" w:eastAsia="fr-FR"/>
         </w:rPr>
-        <w:lastRenderedPageBreak/>
         <w:drawing>
           <wp:inline distT="0" distB="0" distL="0" distR="0" wp14:anchorId="0DB2FD3B" wp14:editId="26A9769C">
-            <wp:extent cx="5760720" cy="2983865"/>
-            <wp:effectExtent l="0" t="0" r="0" b="6985"/>
+            <wp:extent cx="5575498" cy="2983865"/>
+            <wp:effectExtent l="0" t="0" r="6350" b="6985"/>
             <wp:docPr id="9" name="Image 9"/>
             <wp:cNvGraphicFramePr>
               <a:graphicFrameLocks xmlns:a="http://schemas.openxmlformats.org/drawingml/2006/main" noChangeAspect="1"/>
@@ -10259,7 +10270,13 @@
                     <pic:cNvPicPr/>
                   </pic:nvPicPr>
                   <pic:blipFill>
-                    <a:blip r:embed="rId23"/>
+                    <a:blip r:embed="rId23">
+                      <a:extLst>
+                        <a:ext uri="{28A0092B-C50C-407E-A947-70E740481C1C}">
+                          <a14:useLocalDpi xmlns:a14="http://schemas.microsoft.com/office/drawing/2010/main" val="0"/>
+                        </a:ext>
+                      </a:extLst>
+                    </a:blip>
                     <a:stretch>
                       <a:fillRect/>
                     </a:stretch>
@@ -10267,7 +10284,7 @@
                   <pic:spPr>
                     <a:xfrm>
                       <a:off x="0" y="0"/>
-                      <a:ext cx="5760720" cy="2983865"/>
+                      <a:ext cx="5575498" cy="2983865"/>
                     </a:xfrm>
                     <a:prstGeom prst="rect">
                       <a:avLst/>
@@ -10344,7 +10361,7 @@
           <w:lang w:val="fr-FR"/>
         </w:rPr>
       </w:pPr>
-      <w:bookmarkStart w:id="31" w:name="_Toc236349590"/>
+      <w:bookmarkStart w:id="31" w:name="_Toc236915117"/>
       <w:r>
         <w:rPr>
           <w:lang w:val="fr-FR"/>
@@ -10367,7 +10384,15 @@
           <w:rFonts w:asciiTheme="majorBidi" w:hAnsiTheme="majorBidi" w:cstheme="majorBidi"/>
           <w:lang w:val="fr-FR"/>
         </w:rPr>
-        <w:t>Le calcul des indicateurs journaliers (service calcul_indicateurs.py) est exécuté automatiquement chaque jour pour chaque station : cumuls de pluie sur 7 jours, 30 jours et depuis le début de la campagne agricole, cumul d'évapotranspiration de référence (ETo) sur 7 jours, bilan hydrique (différence entre pluie et ETo cumulées), nombre de jours consécutifs sans pluie, détection de gel (température minimale négative), détection de stress thermique (température maximale supérieure à 38°C), risque d'inondation (pluie journalière supérieure à 30 mm sur un sol déjà saturé, bilan hydrique 7 jours positif — seuil provisoire à valider avec le SED), et degrés-jours de croissance (GDD, base 10°C) journaliers et cumulés sur la saison. Pour des raisons de performance, seuls les indicateurs des 45 derniers jours sont retraités quotidiennement, les indicateurs plus anciens étant considérés comme stables — un compromis entre fraîcheur des données et temps de calcul au démarrage.</w:t>
+        <w:t xml:space="preserve">Le calcul des indicateurs journaliers (service calcul_indicateurs.py) est exécuté automatiquement chaque jour pour chaque station : cumuls de pluie sur 7 jours, 30 jours et depuis le début de la campagne agricole, cumul d'évapotranspiration de référence (ETo) sur 7 jours, bilan hydrique (différence entre pluie et ETo cumulées), nombre de jours consécutifs sans pluie, détection de gel (température minimale négative), détection de stress thermique (température maximale supérieure à </w:t>
+      </w:r>
+      <w:r>
+        <w:rPr>
+          <w:rFonts w:asciiTheme="majorBidi" w:hAnsiTheme="majorBidi" w:cstheme="majorBidi"/>
+          <w:lang w:val="fr-FR"/>
+        </w:rPr>
+        <w:lastRenderedPageBreak/>
+        <w:t>38°C), risque d'inondation (pluie journalière supérieure à 30 mm sur un sol déjà saturé, bilan hydrique 7 jours positif — seuil provisoire à valider avec le SED), et degrés-jours de croissance (GDD, base 10°C) journaliers et cumulés sur la saison. Pour des raisons de performance, seuls les indicateurs des 45 derniers jours sont retraités quotidiennement, les indicateurs plus anciens étant considérés comme stables — un compromis entre fraîcheur des données et temps de calcul au démarrage.</w:t>
       </w:r>
     </w:p>
     <w:p>
@@ -10524,11 +10549,10 @@
           <w:noProof/>
           <w:lang w:val="fr-FR" w:eastAsia="fr-FR"/>
         </w:rPr>
-        <w:lastRenderedPageBreak/>
         <w:drawing>
           <wp:inline distT="0" distB="0" distL="0" distR="0" wp14:anchorId="05A35A78" wp14:editId="66D26198">
-            <wp:extent cx="5760720" cy="3122295"/>
-            <wp:effectExtent l="0" t="0" r="0" b="1905"/>
+            <wp:extent cx="5760720" cy="3092217"/>
+            <wp:effectExtent l="0" t="0" r="0" b="0"/>
             <wp:docPr id="19" name="Image 19"/>
             <wp:cNvGraphicFramePr>
               <a:graphicFrameLocks xmlns:a="http://schemas.openxmlformats.org/drawingml/2006/main" noChangeAspect="1"/>
@@ -10541,7 +10565,13 @@
                     <pic:cNvPicPr/>
                   </pic:nvPicPr>
                   <pic:blipFill>
-                    <a:blip r:embed="rId24"/>
+                    <a:blip r:embed="rId24">
+                      <a:extLst>
+                        <a:ext uri="{28A0092B-C50C-407E-A947-70E740481C1C}">
+                          <a14:useLocalDpi xmlns:a14="http://schemas.microsoft.com/office/drawing/2010/main" val="0"/>
+                        </a:ext>
+                      </a:extLst>
+                    </a:blip>
                     <a:stretch>
                       <a:fillRect/>
                     </a:stretch>
@@ -10549,7 +10579,7 @@
                   <pic:spPr>
                     <a:xfrm>
                       <a:off x="0" y="0"/>
-                      <a:ext cx="5760720" cy="3122295"/>
+                      <a:ext cx="5760720" cy="3092217"/>
                     </a:xfrm>
                     <a:prstGeom prst="rect">
                       <a:avLst/>
@@ -10634,7 +10664,7 @@
           <w:lang w:val="fr-FR"/>
         </w:rPr>
       </w:pPr>
-      <w:bookmarkStart w:id="32" w:name="_Toc236349591"/>
+      <w:bookmarkStart w:id="32" w:name="_Toc236915118"/>
       <w:r>
         <w:rPr>
           <w:lang w:val="fr-FR"/>
@@ -10696,8 +10726,8 @@
         </w:rPr>
         <w:drawing>
           <wp:inline distT="0" distB="0" distL="0" distR="0" wp14:anchorId="7BB14DB5" wp14:editId="5BFF0480">
-            <wp:extent cx="5760720" cy="3089275"/>
-            <wp:effectExtent l="0" t="0" r="0" b="0"/>
+            <wp:extent cx="5729527" cy="3089275"/>
+            <wp:effectExtent l="0" t="0" r="5080" b="0"/>
             <wp:docPr id="10" name="Image 10"/>
             <wp:cNvGraphicFramePr>
               <a:graphicFrameLocks xmlns:a="http://schemas.openxmlformats.org/drawingml/2006/main" noChangeAspect="1"/>
@@ -10710,7 +10740,13 @@
                     <pic:cNvPicPr/>
                   </pic:nvPicPr>
                   <pic:blipFill>
-                    <a:blip r:embed="rId25"/>
+                    <a:blip r:embed="rId25">
+                      <a:extLst>
+                        <a:ext uri="{28A0092B-C50C-407E-A947-70E740481C1C}">
+                          <a14:useLocalDpi xmlns:a14="http://schemas.microsoft.com/office/drawing/2010/main" val="0"/>
+                        </a:ext>
+                      </a:extLst>
+                    </a:blip>
                     <a:stretch>
                       <a:fillRect/>
                     </a:stretch>
@@ -10718,7 +10754,7 @@
                   <pic:spPr>
                     <a:xfrm>
                       <a:off x="0" y="0"/>
-                      <a:ext cx="5760720" cy="3089275"/>
+                      <a:ext cx="5729527" cy="3089275"/>
                     </a:xfrm>
                     <a:prstGeom prst="rect">
                       <a:avLst/>
@@ -10785,7 +10821,21 @@
           <w:rFonts w:asciiTheme="majorBidi" w:hAnsiTheme="majorBidi" w:cstheme="majorBidi"/>
           <w:lang w:val="fr-FR"/>
         </w:rPr>
-        <w:t>: Page Graphiques — évolution de la température entre le 71-06-2026 et le 18-07-2026</w:t>
+        <w:t>: Page Graphiques — évoluti</w:t>
+      </w:r>
+      <w:r>
+        <w:rPr>
+          <w:rFonts w:asciiTheme="majorBidi" w:hAnsiTheme="majorBidi" w:cstheme="majorBidi"/>
+          <w:lang w:val="fr-FR"/>
+        </w:rPr>
+        <w:t>on de la température entre le 27-07-2026 et le 03-08</w:t>
+      </w:r>
+      <w:r>
+        <w:rPr>
+          <w:rFonts w:asciiTheme="majorBidi" w:hAnsiTheme="majorBidi" w:cstheme="majorBidi"/>
+          <w:lang w:val="fr-FR"/>
+        </w:rPr>
+        <w:t>-2026</w:t>
       </w:r>
     </w:p>
     <w:p>
@@ -10804,7 +10854,7 @@
           <w:lang w:val="fr-FR"/>
         </w:rPr>
       </w:pPr>
-      <w:bookmarkStart w:id="33" w:name="_Toc236349592"/>
+      <w:bookmarkStart w:id="33" w:name="_Toc236915119"/>
       <w:r>
         <w:rPr>
           <w:lang w:val="fr-FR"/>
@@ -10912,6 +10962,7 @@
           <w:rFonts w:asciiTheme="majorBidi" w:hAnsiTheme="majorBidi" w:cstheme="majorBidi"/>
           <w:lang w:val="fr-FR"/>
         </w:rPr>
+        <w:lastRenderedPageBreak/>
         <w:t>Ce bulletin est initialement produit au format PDF ; au cours du stage, ce format a été remplacé par un export Excel intégrant des graphiques natifs, jugé plus adapté aux besoins d'exploitation ultérieure des données par les destinataires.</w:t>
       </w:r>
     </w:p>
@@ -10963,15 +11014,7 @@
           <w:rFonts w:asciiTheme="majorBidi" w:hAnsiTheme="majorBidi" w:cstheme="majorBidi"/>
           <w:lang w:val="fr-FR"/>
         </w:rPr>
-        <w:t xml:space="preserve">Cette révision a été l'occasion de mettre en évidence un problème de qualité des données plus profond : le site source (avertissement.yobeen.com) exporte, pour chaque journée, un champ type_donnee valant « Mesuré » ou « Prévision » selon que la valeur ait été confirmée par le capteur ou seulement estimée. Ce champ n'était exploité que pour l'entraînement des modèles d'apprentissage </w:t>
-      </w:r>
-      <w:r>
-        <w:rPr>
-          <w:rFonts w:asciiTheme="majorBidi" w:hAnsiTheme="majorBidi" w:cstheme="majorBidi"/>
-          <w:lang w:val="fr-FR"/>
-        </w:rPr>
-        <w:lastRenderedPageBreak/>
-        <w:t>automatique (§3.5) ; ni les indicateurs agroclimatiques ni le bulletin de précipitations ne le prenaient en compte, si bien qu'une prévision non confirmée pouvait ponctuellement être comptée comme une mesure réelle dans un cumul de pluie officiel. Un filtre type_donnee == "Mesuré" a donc été ajouté à l'ensemble des calculs d'indicateurs et de rapports :</w:t>
+        <w:t>Cette révision a été l'occasion de mettre en évidence un problème de qualité des données plus profond : le site source (avertissement.yobeen.com) exporte, pour chaque journée, un champ type_donnee valant « Mesuré » ou « Prévision » selon que la valeur ait été confirmée par le capteur ou seulement estimée. Ce champ n'était exploité que pour l'entraînement des modèles d'apprentissage automatique (§3.5) ; ni les indicateurs agroclimatiques ni le bulletin de précipitations ne le prenaient en compte, si bien qu'une prévision non confirmée pouvait ponctuellement être comptée comme une mesure réelle dans un cumul de pluie officiel. Un filtre type_donnee == "Mesuré" a donc été ajouté à l'ensemble des calculs d'indicateurs et de rapports :</w:t>
       </w:r>
     </w:p>
     <w:p>
@@ -11184,6 +11227,7 @@
           <w:rFonts w:asciiTheme="majorBidi" w:hAnsiTheme="majorBidi" w:cstheme="majorBidi"/>
           <w:lang w:val="fr-FR"/>
         </w:rPr>
+        <w:lastRenderedPageBreak/>
         <w:t>Une relecture plus fine du champ « Pluie 24h » a par ailleurs révélé une seconde imprécision, distincte du filtre Mesuré/Prévision ci-dessus : la valeur reprenait directement l'agrégat journalier calculé par le site source, c'est-à-dire un cumul calendaire minuit-minuit, et non une véritable somme calée sur le cycle 6h-6h annoncé — une approximation qui, de surcroît, portait systématiquement sur le jour même au moment précis où la tâche s'exécutait (6h00), une journée dont aucune mesure n'était encore confirmée à cet instant. L'exploration des options d'export du site source a révélé un type de données « Brute » (relevés au pas de 15 minutes, absent des options utilisées jusque-là) permettant de sommer précisément la pluie entre les deux bornes exactes du cycle. Cette somme a été implémentée (cumul_pluie_brute, import_automatique.py), avec repli sur l'agrégat journalier de la veille si la connexion au site source échoue, et la tâche quotidienne elle-même décalée de 6h00 à 8h00 pour laisser le temps au délai de transmission observé sur ce flux brut (environ deux heures) de se résorber.</w:t>
       </w:r>
     </w:p>
@@ -11227,11 +11271,10 @@
           <w:noProof/>
           <w:lang w:val="fr-FR" w:eastAsia="fr-FR"/>
         </w:rPr>
-        <w:lastRenderedPageBreak/>
         <w:drawing>
           <wp:inline distT="0" distB="0" distL="0" distR="0" wp14:anchorId="2AFA4368" wp14:editId="5DF8A86C">
-            <wp:extent cx="5895961" cy="3420093"/>
-            <wp:effectExtent l="0" t="0" r="0" b="9525"/>
+            <wp:extent cx="5907853" cy="3180204"/>
+            <wp:effectExtent l="0" t="0" r="0" b="1270"/>
             <wp:docPr id="11" name="Image 11"/>
             <wp:cNvGraphicFramePr>
               <a:graphicFrameLocks xmlns:a="http://schemas.openxmlformats.org/drawingml/2006/main" noChangeAspect="1"/>
@@ -11258,7 +11301,7 @@
                   <pic:spPr>
                     <a:xfrm>
                       <a:off x="0" y="0"/>
-                      <a:ext cx="5907853" cy="3426991"/>
+                      <a:ext cx="5907853" cy="3180204"/>
                     </a:xfrm>
                     <a:prstGeom prst="rect">
                       <a:avLst/>
@@ -11352,6 +11395,7 @@
           <w:noProof/>
           <w:lang w:val="fr-FR" w:eastAsia="fr-FR"/>
         </w:rPr>
+        <w:lastRenderedPageBreak/>
         <w:drawing>
           <wp:inline distT="0" distB="0" distL="0" distR="0">
             <wp:extent cx="5760720" cy="4074160"/>
@@ -11467,7 +11511,6 @@
           <w:noProof/>
           <w:lang w:val="fr-FR" w:eastAsia="fr-FR"/>
         </w:rPr>
-        <w:lastRenderedPageBreak/>
         <w:drawing>
           <wp:inline distT="0" distB="0" distL="0" distR="0" wp14:anchorId="7C509C04" wp14:editId="3B7E407C">
             <wp:extent cx="5760720" cy="4074160"/>
@@ -11584,11 +11627,12 @@
           <w:lang w:val="fr-FR"/>
         </w:rPr>
       </w:pPr>
-      <w:bookmarkStart w:id="34" w:name="_Toc236349593"/>
-      <w:r>
-        <w:rPr>
-          <w:lang w:val="fr-FR"/>
-        </w:rPr>
+      <w:bookmarkStart w:id="34" w:name="_Toc236915120"/>
+      <w:r>
+        <w:rPr>
+          <w:lang w:val="fr-FR"/>
+        </w:rPr>
+        <w:lastRenderedPageBreak/>
         <w:t>4.8 Module Indicateurs — détection d'anomalies (IA)</w:t>
       </w:r>
       <w:bookmarkEnd w:id="34"/>
@@ -11614,7 +11658,7 @@
       <w:pPr>
         <w:keepNext/>
         <w:spacing w:line="312" w:lineRule="auto"/>
-        <w:jc w:val="both"/>
+        <w:jc w:val="center"/>
         <w:rPr>
           <w:rFonts w:asciiTheme="majorBidi" w:hAnsiTheme="majorBidi" w:cstheme="majorBidi"/>
         </w:rPr>
@@ -11625,11 +11669,10 @@
           <w:noProof/>
           <w:lang w:val="fr-FR" w:eastAsia="fr-FR"/>
         </w:rPr>
-        <w:lastRenderedPageBreak/>
         <w:drawing>
           <wp:inline distT="0" distB="0" distL="0" distR="0" wp14:anchorId="3D1893D1" wp14:editId="72EB8739">
-            <wp:extent cx="5760720" cy="3089275"/>
-            <wp:effectExtent l="0" t="0" r="0" b="0"/>
+            <wp:extent cx="4995081" cy="1310615"/>
+            <wp:effectExtent l="0" t="0" r="0" b="4445"/>
             <wp:docPr id="16" name="Image 16"/>
             <wp:cNvGraphicFramePr>
               <a:graphicFrameLocks xmlns:a="http://schemas.openxmlformats.org/drawingml/2006/main" noChangeAspect="1"/>
@@ -11641,20 +11684,27 @@
                     <pic:cNvPr id="1" name=""/>
                     <pic:cNvPicPr/>
                   </pic:nvPicPr>
-                  <pic:blipFill>
+                  <pic:blipFill rotWithShape="1">
                     <a:blip r:embed="rId29"/>
-                    <a:stretch>
-                      <a:fillRect/>
-                    </a:stretch>
+                    <a:srcRect l="12323" t="57564" r="945"/>
+                    <a:stretch/>
                   </pic:blipFill>
-                  <pic:spPr>
+                  <pic:spPr bwMode="auto">
                     <a:xfrm>
                       <a:off x="0" y="0"/>
-                      <a:ext cx="5760720" cy="3089275"/>
+                      <a:ext cx="4996408" cy="1310963"/>
                     </a:xfrm>
                     <a:prstGeom prst="rect">
                       <a:avLst/>
                     </a:prstGeom>
+                    <a:ln>
+                      <a:noFill/>
+                    </a:ln>
+                    <a:extLst>
+                      <a:ext uri="{53640926-AAD7-44D8-BBD7-CCE9431645EC}">
+                        <a14:shadowObscured xmlns:a14="http://schemas.microsoft.com/office/drawing/2010/main"/>
+                      </a:ext>
+                    </a:extLst>
                   </pic:spPr>
                 </pic:pic>
               </a:graphicData>
@@ -11727,7 +11777,7 @@
           <w:lang w:val="fr-FR"/>
         </w:rPr>
       </w:pPr>
-      <w:bookmarkStart w:id="35" w:name="_Toc236349594"/>
+      <w:bookmarkStart w:id="35" w:name="_Toc236915121"/>
       <w:r>
         <w:rPr>
           <w:lang w:val="fr-FR"/>
@@ -11750,14 +11800,13 @@
           <w:rFonts w:asciiTheme="majorBidi" w:hAnsiTheme="majorBidi" w:cstheme="majorBidi"/>
           <w:lang w:val="fr-FR"/>
         </w:rPr>
-        <w:t>L'accès à l'application est protégé par un système d'authentification, les mots de passe étant hachés avec bcrypt et jamais stockés en clair. Le contrôle d'accès repose sur trois rôles (Administrateur, Technicien, Consultation). Toute création ou modification de compte, changement de rôle, activation/désactivation ou réinitialisation de mot de passe est enregistrée dans la table historique_modifications et consultable depuis la page Utilisateurs, assurant la traçabilité des actions sensibles.</w:t>
+        <w:t>L'accès à l'application est protégé par un système d'authentification, les mots de passe étant hachés avec bcrypt et jamais stockés en clair. Le contrôle d'accès repose sur trois rôles (Administrateur, Technicien, Consultation) : les actions d'écriture non autorisées pour le rôle connecté (import, gestion des stations, recalcul des indicateurs et génération de rapports pour Consultation ; gestion des comptes et paramètres système réservée à l'Administrateur) sont désactivées dans l'interface, avec une infobulle expliquant la restriction plutôt qu'une simple absence de réaction au clic. Toute création ou modification de compte, changement de rôle, activation/désactivation ou réinitialisation de mot de passe est enregistrée dans la table historique_modifications et consultable depuis la page Utilisateurs, assurant la traçabilité des actions sensibles.</w:t>
       </w:r>
     </w:p>
     <w:p>
       <w:pPr>
         <w:keepNext/>
         <w:spacing w:line="312" w:lineRule="auto"/>
-        <w:jc w:val="center"/>
         <w:rPr>
           <w:rFonts w:asciiTheme="majorBidi" w:hAnsiTheme="majorBidi" w:cstheme="majorBidi"/>
         </w:rPr>
@@ -11768,10 +11817,11 @@
           <w:noProof/>
           <w:lang w:val="fr-FR" w:eastAsia="fr-FR"/>
         </w:rPr>
+        <w:lastRenderedPageBreak/>
         <w:drawing>
           <wp:inline distT="0" distB="0" distL="0" distR="0" wp14:anchorId="768F92E0" wp14:editId="7D029428">
-            <wp:extent cx="5760720" cy="3098165"/>
-            <wp:effectExtent l="0" t="0" r="0" b="6985"/>
+            <wp:extent cx="5744327" cy="3098165"/>
+            <wp:effectExtent l="0" t="0" r="8890" b="6985"/>
             <wp:docPr id="17" name="Image 17"/>
             <wp:cNvGraphicFramePr>
               <a:graphicFrameLocks xmlns:a="http://schemas.openxmlformats.org/drawingml/2006/main" noChangeAspect="1"/>
@@ -11784,7 +11834,13 @@
                     <pic:cNvPicPr/>
                   </pic:nvPicPr>
                   <pic:blipFill>
-                    <a:blip r:embed="rId30"/>
+                    <a:blip r:embed="rId30">
+                      <a:extLst>
+                        <a:ext uri="{28A0092B-C50C-407E-A947-70E740481C1C}">
+                          <a14:useLocalDpi xmlns:a14="http://schemas.microsoft.com/office/drawing/2010/main" val="0"/>
+                        </a:ext>
+                      </a:extLst>
+                    </a:blip>
                     <a:stretch>
                       <a:fillRect/>
                     </a:stretch>
@@ -11792,7 +11848,7 @@
                   <pic:spPr>
                     <a:xfrm>
                       <a:off x="0" y="0"/>
-                      <a:ext cx="5760720" cy="3098165"/>
+                      <a:ext cx="5744327" cy="3098165"/>
                     </a:xfrm>
                     <a:prstGeom prst="rect">
                       <a:avLst/>
@@ -11869,12 +11925,11 @@
           <w:lang w:val="fr-FR"/>
         </w:rPr>
       </w:pPr>
-      <w:bookmarkStart w:id="36" w:name="_Toc236349595"/>
-      <w:r>
-        <w:rPr>
-          <w:lang w:val="fr-FR"/>
-        </w:rPr>
-        <w:lastRenderedPageBreak/>
+      <w:bookmarkStart w:id="36" w:name="_Toc236915122"/>
+      <w:r>
+        <w:rPr>
+          <w:lang w:val="fr-FR"/>
+        </w:rPr>
         <w:t>4.10 Module Sauvegarde</w:t>
       </w:r>
       <w:bookmarkEnd w:id="36"/>
@@ -12174,10 +12229,11 @@
           <w:noProof/>
           <w:lang w:val="fr-FR" w:eastAsia="fr-FR"/>
         </w:rPr>
+        <w:lastRenderedPageBreak/>
         <w:drawing>
           <wp:inline distT="0" distB="0" distL="0" distR="0" wp14:anchorId="16FC141D" wp14:editId="5F9C698F">
-            <wp:extent cx="5760720" cy="3082925"/>
-            <wp:effectExtent l="0" t="0" r="0" b="3175"/>
+            <wp:extent cx="5732687" cy="3082925"/>
+            <wp:effectExtent l="0" t="0" r="1905" b="3175"/>
             <wp:docPr id="18" name="Image 18"/>
             <wp:cNvGraphicFramePr>
               <a:graphicFrameLocks xmlns:a="http://schemas.openxmlformats.org/drawingml/2006/main" noChangeAspect="1"/>
@@ -12190,7 +12246,13 @@
                     <pic:cNvPicPr/>
                   </pic:nvPicPr>
                   <pic:blipFill>
-                    <a:blip r:embed="rId31"/>
+                    <a:blip r:embed="rId31">
+                      <a:extLst>
+                        <a:ext uri="{28A0092B-C50C-407E-A947-70E740481C1C}">
+                          <a14:useLocalDpi xmlns:a14="http://schemas.microsoft.com/office/drawing/2010/main" val="0"/>
+                        </a:ext>
+                      </a:extLst>
+                    </a:blip>
                     <a:stretch>
                       <a:fillRect/>
                     </a:stretch>
@@ -12198,7 +12260,7 @@
                   <pic:spPr>
                     <a:xfrm>
                       <a:off x="0" y="0"/>
-                      <a:ext cx="5760720" cy="3082925"/>
+                      <a:ext cx="5732687" cy="3082925"/>
                     </a:xfrm>
                     <a:prstGeom prst="rect">
                       <a:avLst/>
@@ -12291,7 +12353,7 @@
         </w:rPr>
       </w:pPr>
       <w:bookmarkStart w:id="37" w:name="_Toc900000013"/>
-      <w:bookmarkStart w:id="38" w:name="_Toc236349596"/>
+      <w:bookmarkStart w:id="38" w:name="_Toc236915123"/>
       <w:r>
         <w:rPr>
           <w:lang w:val="fr-FR"/>
@@ -12521,7 +12583,7 @@
           <w:lang w:val="fr-FR"/>
         </w:rPr>
       </w:pPr>
-      <w:bookmarkStart w:id="39" w:name="_Toc236349597"/>
+      <w:bookmarkStart w:id="39" w:name="_Toc236915124"/>
       <w:r>
         <w:rPr>
           <w:lang w:val="fr-FR"/>
@@ -12538,7 +12600,7 @@
           <w:lang w:val="fr-FR"/>
         </w:rPr>
       </w:pPr>
-      <w:bookmarkStart w:id="40" w:name="_Toc236349598"/>
+      <w:bookmarkStart w:id="40" w:name="_Toc236915125"/>
       <w:r>
         <w:rPr>
           <w:lang w:val="fr-FR"/>
@@ -12568,7 +12630,7 @@
       <w:pPr>
         <w:pStyle w:val="Titre2"/>
       </w:pPr>
-      <w:bookmarkStart w:id="41" w:name="_Toc236349599"/>
+      <w:bookmarkStart w:id="41" w:name="_Toc236915126"/>
       <w:r>
         <w:t>5.2 Tests fonctionnels</w:t>
       </w:r>
@@ -12717,7 +12779,7 @@
           <w:lang w:val="fr-FR"/>
         </w:rPr>
       </w:pPr>
-      <w:bookmarkStart w:id="42" w:name="_Toc236349600"/>
+      <w:bookmarkStart w:id="42" w:name="_Toc236915127"/>
       <w:r>
         <w:rPr>
           <w:lang w:val="fr-FR"/>
@@ -12747,7 +12809,7 @@
       <w:pPr>
         <w:pStyle w:val="Titre2"/>
       </w:pPr>
-      <w:bookmarkStart w:id="43" w:name="_Toc236349601"/>
+      <w:bookmarkStart w:id="43" w:name="_Toc236915128"/>
       <w:r>
         <w:t>5.4 Limites identifiées</w:t>
       </w:r>
@@ -12851,7 +12913,7 @@
           <w:lang w:val="fr-FR"/>
         </w:rPr>
       </w:pPr>
-      <w:bookmarkStart w:id="44" w:name="_Toc236349602"/>
+      <w:bookmarkStart w:id="44" w:name="_Toc236915129"/>
       <w:r>
         <w:rPr>
           <w:lang w:val="fr-FR"/>
@@ -12886,7 +12948,7 @@
           <w:lang w:val="fr-FR"/>
         </w:rPr>
       </w:pPr>
-      <w:bookmarkStart w:id="45" w:name="_Toc236349603"/>
+      <w:bookmarkStart w:id="45" w:name="_Toc236915130"/>
       <w:r>
         <w:rPr>
           <w:color w:val="auto"/>
@@ -13844,7 +13906,7 @@
           <w:lang w:val="fr-FR"/>
         </w:rPr>
       </w:pPr>
-      <w:bookmarkStart w:id="46" w:name="_Toc236349604"/>
+      <w:bookmarkStart w:id="46" w:name="_Toc236915131"/>
       <w:r>
         <w:rPr>
           <w:lang w:val="fr-FR"/>
@@ -15478,7 +15540,7 @@
           <w:lang w:val="fr-FR"/>
         </w:rPr>
       </w:pPr>
-      <w:bookmarkStart w:id="47" w:name="_Toc236349605"/>
+      <w:bookmarkStart w:id="47" w:name="_Toc236915132"/>
       <w:r>
         <w:rPr>
           <w:lang w:val="fr-FR"/>
@@ -16243,7 +16305,7 @@
           <w:lang w:val="fr-FR"/>
         </w:rPr>
       </w:pPr>
-      <w:bookmarkStart w:id="48" w:name="_Toc236349606"/>
+      <w:bookmarkStart w:id="48" w:name="_Toc236915133"/>
       <w:r>
         <w:rPr>
           <w:lang w:val="fr-FR"/>
@@ -16276,7 +16338,7 @@
           <w:lang w:val="fr-FR"/>
         </w:rPr>
       </w:pPr>
-      <w:bookmarkStart w:id="49" w:name="_Toc236349607"/>
+      <w:bookmarkStart w:id="49" w:name="_Toc236915134"/>
       <w:r>
         <w:rPr>
           <w:lang w:val="fr-FR"/>
@@ -16343,7 +16405,7 @@
           <w:lang w:val="fr-FR"/>
         </w:rPr>
       </w:pPr>
-      <w:bookmarkStart w:id="50" w:name="_Toc236349608"/>
+      <w:bookmarkStart w:id="50" w:name="_Toc236915135"/>
       <w:r>
         <w:rPr>
           <w:lang w:val="fr-FR"/>
@@ -16389,15 +16451,7 @@
           <w:rFonts w:asciiTheme="majorBidi" w:hAnsiTheme="majorBidi" w:cstheme="majorBidi"/>
           <w:lang w:val="fr-FR"/>
         </w:rPr>
-        <w:t xml:space="preserve">Pour la pluie, la corrélation moyenne inter-stations est de 0,72 (de 0,53 à 0,93 selon les paires) : une valeur relativement élevée, cohérente avec des épisodes pluvieux qui touchent souvent l'ensemble de la plaine du Gharb, même si la quantité exacte reçue reste très locale — un constat qui rejoint </w:t>
-      </w:r>
-      <w:r>
-        <w:rPr>
-          <w:rFonts w:asciiTheme="majorBidi" w:hAnsiTheme="majorBidi" w:cstheme="majorBidi"/>
-          <w:lang w:val="fr-FR"/>
-        </w:rPr>
-        <w:lastRenderedPageBreak/>
-        <w:t>directement celui du modèle LSTM (§6.3) : bonne détection de l'occurrence de pluie, quantité prévue peu fiable. La station de Sidi Allal Tazi ressort comme la moins corrélée au reste du réseau.</w:t>
+        <w:t xml:space="preserve">Pour la pluie, la corrélation moyenne inter-stations est de 0,72 (de 0,53 à 0,93 selon les paires) : une valeur assez élevée, les épisodes pluvieux touchant souvent toute la plaine du Gharb même si la quantité reçue reste très locale — même limite que celle du LSTM (§6.3) : bonne détection de l'occurrence, quantité peu fiable. La station de Sidi Allal Tazi ressort comme la moins corrélée au reste du réseau.</w:t>
       </w:r>
     </w:p>
     <w:p>
@@ -16542,7 +16596,7 @@
           <w:rFonts w:asciiTheme="majorBidi" w:hAnsiTheme="majorBidi" w:cstheme="majorBidi"/>
           <w:lang w:val="fr-FR"/>
         </w:rPr>
-        <w:t>Pour la température, la corrélation moyenne atteint 0,92 et dépasse 0,95 pour la quasi-totalité des paires de stations, à une exception nette : Lamnassra, dont la corrélation avec ses voisines chute entre 0,35 et 0,56, nettement visible sur la carte de chaleur ci-dessous. Cette station fait précisément partie du groupe « plus humide et frais » (avec Sidi Allal Tazi et Kénitra Banlieue) identifié par le regroupement par k-moyennes du §6.5 : deux méthodes indépendantes — profil climatique moyen et corrélation temporelle — convergent ainsi vers les mêmes stations atypiques, ce qui renforce la confiance dans cette typologie.</w:t>
+        <w:t xml:space="preserve">Pour la température, la corrélation moyenne atteint 0,92 et dépasse 0,95 pour la quasi-totalité des paires, à une exception nette : Lamnassra, dont la corrélation avec ses voisines chute entre 0,35 et 0,56, visible sur la carte de chaleur ci-dessous. Lamnassra fait justement partie du groupe « plus humide et frais » (avec Sidi Allal Tazi et Kénitra Banlieue) identifié par le k-moyennes du §6.5 : les deux méthodes pointent vers les mêmes stations atypiques.</w:t>
       </w:r>
     </w:p>
     <w:p>
@@ -16675,7 +16729,7 @@
           <w:rFonts w:asciiTheme="majorBidi" w:hAnsiTheme="majorBidi" w:cstheme="majorBidi"/>
           <w:lang w:val="fr-FR"/>
         </w:rPr>
-        <w:t>Au-delà de cette validation croisée, une telle analyse offre un intérêt opérationnel : une station qui décroche soudainement de sa corrélation habituelle avec ses voisines constitue un signal supplémentaire de panne capteur, et la station la plus corrélée à une autre peut servir de référence pour estimer des valeurs manquantes en cas d'indisponibilité temporaire.</w:t>
+        <w:t xml:space="preserve">Ce type d'analyse a aussi un usage opérationnel : une station qui décroche soudainement de sa corrélation habituelle avec ses voisines est un signal supplémentaire de panne capteur, et la station la plus corrélée à une autre sert de référence pour estimer des valeurs manquantes en cas d'indisponibilité temporaire.</w:t>
       </w:r>
     </w:p>
     <w:p>
@@ -16719,7 +16773,7 @@
           <w:lang w:val="fr-FR"/>
         </w:rPr>
       </w:pPr>
-      <w:bookmarkStart w:id="51" w:name="_Toc236349609"/>
+      <w:bookmarkStart w:id="51" w:name="_Toc236915136"/>
       <w:r>
         <w:rPr>
           <w:lang w:val="fr-FR"/>
@@ -16921,7 +16975,7 @@
           <w:lang w:val="fr-FR"/>
         </w:rPr>
       </w:pPr>
-      <w:bookmarkStart w:id="52" w:name="_Toc236349610"/>
+      <w:bookmarkStart w:id="52" w:name="_Toc236915137"/>
       <w:r>
         <w:rPr>
           <w:lang w:val="fr-FR"/>
@@ -17144,7 +17198,7 @@
           <w:lang w:val="fr-FR"/>
         </w:rPr>
       </w:pPr>
-      <w:bookmarkStart w:id="53" w:name="_Toc236349611"/>
+      <w:bookmarkStart w:id="53" w:name="_Toc236915138"/>
       <w:r>
         <w:rPr>
           <w:lang w:val="fr-FR"/>
@@ -17161,7 +17215,7 @@
           <w:lang w:val="fr-FR"/>
         </w:rPr>
       </w:pPr>
-      <w:bookmarkStart w:id="54" w:name="_Toc236349612"/>
+      <w:bookmarkStart w:id="54" w:name="_Toc236915139"/>
       <w:r>
         <w:rPr>
           <w:lang w:val="fr-FR"/>
@@ -17259,7 +17313,7 @@
       <w:pPr>
         <w:pStyle w:val="Titre2"/>
       </w:pPr>
-      <w:bookmarkStart w:id="55" w:name="_Toc236349613"/>
+      <w:bookmarkStart w:id="55" w:name="_Toc236915140"/>
       <w:r>
         <w:t>Annexe B — Liste des abréviations</w:t>
       </w:r>
@@ -17940,7 +17994,7 @@
         <w:color w:val="595959"/>
         <w:sz w:val="18"/>
       </w:rPr>
-      <w:t>5</w:t>
+      <w:t>4</w:t>
     </w:r>
     <w:r>
       <w:rPr>
@@ -18031,15 +18085,6 @@
         <w:lang w:val="fr-FR"/>
       </w:rPr>
     </w:pPr>
-    <w:r>
-      <w:rPr>
-        <w:i/>
-        <w:color w:val="595959"/>
-        <w:sz w:val="16"/>
-        <w:lang w:val="fr-FR"/>
-      </w:rPr>
-      <w:t>ORMVAG Météo Manager — Rapport de stage</w:t>
-    </w:r>
   </w:p>
 </w:hdr>
 </file>
@@ -32677,34 +32722,34 @@
     </dgm:pt>
   </dgm:ptLst>
   <dgm:cxnLst>
+    <dgm:cxn modelId="{87780263-9497-4ECB-94F8-67DEAF06C491}" srcId="{B8C1CAC9-9632-48FF-A314-2E1410CC34C6}" destId="{C096F7B4-4EEE-4D0A-AF74-8096A5CFB2A3}" srcOrd="0" destOrd="0" parTransId="{5F48E481-DF7D-4046-94E4-3C4579D0AEBF}" sibTransId="{809B3144-7AD3-4DE8-BAA6-3E95C4069EB8}"/>
+    <dgm:cxn modelId="{6A6B6382-A5AE-4920-A4E1-C3EED4D6041B}" srcId="{B8C1CAC9-9632-48FF-A314-2E1410CC34C6}" destId="{51069507-B1BA-4C82-9B11-74FA83C26FDB}" srcOrd="2" destOrd="0" parTransId="{09244126-7770-48F9-84F4-F7DE55C2C3A6}" sibTransId="{A8F2E825-40F7-4D49-A021-0857D3094A4B}"/>
+    <dgm:cxn modelId="{2EAB69B3-1C10-4ABB-B295-B43E5E9074C1}" type="presOf" srcId="{B8C1CAC9-9632-48FF-A314-2E1410CC34C6}" destId="{AEA3D86A-0484-4F9D-A099-D32E5BC381C4}" srcOrd="0" destOrd="0" presId="urn:microsoft.com/office/officeart/2005/8/layout/default"/>
+    <dgm:cxn modelId="{55297978-9B23-4D63-AEFA-9302E1222EC9}" srcId="{B8C1CAC9-9632-48FF-A314-2E1410CC34C6}" destId="{6E6569E0-9CD4-4FA3-A7C3-795311D0C912}" srcOrd="3" destOrd="0" parTransId="{F2D5CE26-9DF2-4365-B82B-AFA670FE62DB}" sibTransId="{0AFD97A7-8BA6-42E7-978E-9176938502DA}"/>
+    <dgm:cxn modelId="{14D9C28D-8B4B-419E-A9E2-C878BE5BEC00}" type="presOf" srcId="{CA2DD3CD-7E96-4C77-86FC-00553936F051}" destId="{B2F27306-FCCA-478A-A75A-A14C0ECD389D}" srcOrd="0" destOrd="0" presId="urn:microsoft.com/office/officeart/2005/8/layout/default"/>
+    <dgm:cxn modelId="{A39597B2-E063-4E17-9AD4-206E063AAAAE}" srcId="{B8C1CAC9-9632-48FF-A314-2E1410CC34C6}" destId="{326AB8E0-7A9A-4DAB-9974-647167EF028F}" srcOrd="4" destOrd="0" parTransId="{FB7940C0-49B4-4FEA-ABC8-178F4B765C4F}" sibTransId="{EB1BA589-4EC1-422D-B747-F3953C8AC498}"/>
+    <dgm:cxn modelId="{3F921F72-ADEC-4CEE-90F1-D934D88C75BD}" type="presOf" srcId="{51069507-B1BA-4C82-9B11-74FA83C26FDB}" destId="{5DE467AF-B7E2-42C5-A6F5-3FE74107E0DD}" srcOrd="0" destOrd="0" presId="urn:microsoft.com/office/officeart/2005/8/layout/default"/>
+    <dgm:cxn modelId="{12E8DB24-457B-454D-9C9D-2FCA8A25D898}" srcId="{B8C1CAC9-9632-48FF-A314-2E1410CC34C6}" destId="{E32A4DE3-B1E7-4D7B-8880-13414145CEC7}" srcOrd="6" destOrd="0" parTransId="{9A1F73F3-7FDB-4704-929C-2A3B3F615376}" sibTransId="{717F3F1E-EA20-45D2-83EE-E5651631CD29}"/>
+    <dgm:cxn modelId="{13EECB54-BFE8-40FF-B536-5DD1800432CA}" type="presOf" srcId="{9BD651A7-CE26-462A-A33C-597AF20ECD97}" destId="{9FB35D74-3983-4302-96C9-E2CDDE357635}" srcOrd="0" destOrd="0" presId="urn:microsoft.com/office/officeart/2005/8/layout/default"/>
+    <dgm:cxn modelId="{183201E8-A03E-48DD-813F-F27D5C6CF52C}" type="presOf" srcId="{6E6569E0-9CD4-4FA3-A7C3-795311D0C912}" destId="{F65EA607-E87D-49EF-A5DF-DF0C184738F5}" srcOrd="0" destOrd="0" presId="urn:microsoft.com/office/officeart/2005/8/layout/default"/>
+    <dgm:cxn modelId="{CE03C2E9-39F0-4DCC-847B-E95780E23D4B}" srcId="{B8C1CAC9-9632-48FF-A314-2E1410CC34C6}" destId="{9BD651A7-CE26-462A-A33C-597AF20ECD97}" srcOrd="1" destOrd="0" parTransId="{39FCFB4E-954E-4C2E-8881-BFD09847583A}" sibTransId="{0A6BD409-D923-40CF-9F35-10556A76282A}"/>
     <dgm:cxn modelId="{16B0DF0A-2EE9-4ED3-8C4E-C3D88977EB70}" srcId="{B8C1CAC9-9632-48FF-A314-2E1410CC34C6}" destId="{CA2DD3CD-7E96-4C77-86FC-00553936F051}" srcOrd="5" destOrd="0" parTransId="{9F51FC9A-351B-4D7C-916D-BCC7255429E7}" sibTransId="{875FACC2-5FB5-40C7-9852-6528C85885AA}"/>
-    <dgm:cxn modelId="{55297978-9B23-4D63-AEFA-9302E1222EC9}" srcId="{B8C1CAC9-9632-48FF-A314-2E1410CC34C6}" destId="{6E6569E0-9CD4-4FA3-A7C3-795311D0C912}" srcOrd="3" destOrd="0" parTransId="{F2D5CE26-9DF2-4365-B82B-AFA670FE62DB}" sibTransId="{0AFD97A7-8BA6-42E7-978E-9176938502DA}"/>
-    <dgm:cxn modelId="{87780263-9497-4ECB-94F8-67DEAF06C491}" srcId="{B8C1CAC9-9632-48FF-A314-2E1410CC34C6}" destId="{C096F7B4-4EEE-4D0A-AF74-8096A5CFB2A3}" srcOrd="0" destOrd="0" parTransId="{5F48E481-DF7D-4046-94E4-3C4579D0AEBF}" sibTransId="{809B3144-7AD3-4DE8-BAA6-3E95C4069EB8}"/>
-    <dgm:cxn modelId="{CE03C2E9-39F0-4DCC-847B-E95780E23D4B}" srcId="{B8C1CAC9-9632-48FF-A314-2E1410CC34C6}" destId="{9BD651A7-CE26-462A-A33C-597AF20ECD97}" srcOrd="1" destOrd="0" parTransId="{39FCFB4E-954E-4C2E-8881-BFD09847583A}" sibTransId="{0A6BD409-D923-40CF-9F35-10556A76282A}"/>
-    <dgm:cxn modelId="{BA4C2B28-4CE5-4E87-BDA7-3E90F4FF2311}" type="presOf" srcId="{51069507-B1BA-4C82-9B11-74FA83C26FDB}" destId="{5DE467AF-B7E2-42C5-A6F5-3FE74107E0DD}" srcOrd="0" destOrd="0" presId="urn:microsoft.com/office/officeart/2005/8/layout/default"/>
-    <dgm:cxn modelId="{EFFED8B9-EC98-40DC-AB8C-314FFD6FE8DE}" type="presOf" srcId="{E32A4DE3-B1E7-4D7B-8880-13414145CEC7}" destId="{429C31D0-4D18-4C99-B72B-4E01415F2E48}" srcOrd="0" destOrd="0" presId="urn:microsoft.com/office/officeart/2005/8/layout/default"/>
-    <dgm:cxn modelId="{7D1CD14D-10F4-4329-9705-88FD2E79BA4C}" type="presOf" srcId="{B8C1CAC9-9632-48FF-A314-2E1410CC34C6}" destId="{AEA3D86A-0484-4F9D-A099-D32E5BC381C4}" srcOrd="0" destOrd="0" presId="urn:microsoft.com/office/officeart/2005/8/layout/default"/>
-    <dgm:cxn modelId="{6B31F100-7DAE-4BC5-A9BE-3CC6E03A3E4F}" type="presOf" srcId="{6E6569E0-9CD4-4FA3-A7C3-795311D0C912}" destId="{F65EA607-E87D-49EF-A5DF-DF0C184738F5}" srcOrd="0" destOrd="0" presId="urn:microsoft.com/office/officeart/2005/8/layout/default"/>
-    <dgm:cxn modelId="{A656A834-00CE-4267-B1D7-661693420444}" type="presOf" srcId="{326AB8E0-7A9A-4DAB-9974-647167EF028F}" destId="{546C8C6B-92D1-446A-B8EB-2BF3CC6CABC4}" srcOrd="0" destOrd="0" presId="urn:microsoft.com/office/officeart/2005/8/layout/default"/>
-    <dgm:cxn modelId="{3A46EC79-73BB-4EFB-8DFA-73ED3FE3ACF4}" type="presOf" srcId="{CA2DD3CD-7E96-4C77-86FC-00553936F051}" destId="{B2F27306-FCCA-478A-A75A-A14C0ECD389D}" srcOrd="0" destOrd="0" presId="urn:microsoft.com/office/officeart/2005/8/layout/default"/>
-    <dgm:cxn modelId="{7A036F89-1818-4DE2-B82A-086063E80D7A}" type="presOf" srcId="{C096F7B4-4EEE-4D0A-AF74-8096A5CFB2A3}" destId="{328CDBFB-495C-4F9E-B2A3-EF54F47EA8B6}" srcOrd="0" destOrd="0" presId="urn:microsoft.com/office/officeart/2005/8/layout/default"/>
-    <dgm:cxn modelId="{A39597B2-E063-4E17-9AD4-206E063AAAAE}" srcId="{B8C1CAC9-9632-48FF-A314-2E1410CC34C6}" destId="{326AB8E0-7A9A-4DAB-9974-647167EF028F}" srcOrd="4" destOrd="0" parTransId="{FB7940C0-49B4-4FEA-ABC8-178F4B765C4F}" sibTransId="{EB1BA589-4EC1-422D-B747-F3953C8AC498}"/>
-    <dgm:cxn modelId="{6A6B6382-A5AE-4920-A4E1-C3EED4D6041B}" srcId="{B8C1CAC9-9632-48FF-A314-2E1410CC34C6}" destId="{51069507-B1BA-4C82-9B11-74FA83C26FDB}" srcOrd="2" destOrd="0" parTransId="{09244126-7770-48F9-84F4-F7DE55C2C3A6}" sibTransId="{A8F2E825-40F7-4D49-A021-0857D3094A4B}"/>
-    <dgm:cxn modelId="{12E8DB24-457B-454D-9C9D-2FCA8A25D898}" srcId="{B8C1CAC9-9632-48FF-A314-2E1410CC34C6}" destId="{E32A4DE3-B1E7-4D7B-8880-13414145CEC7}" srcOrd="6" destOrd="0" parTransId="{9A1F73F3-7FDB-4704-929C-2A3B3F615376}" sibTransId="{717F3F1E-EA20-45D2-83EE-E5651631CD29}"/>
-    <dgm:cxn modelId="{4BB59455-7CC2-4A0B-AC14-4F79C16C8E81}" type="presOf" srcId="{9BD651A7-CE26-462A-A33C-597AF20ECD97}" destId="{9FB35D74-3983-4302-96C9-E2CDDE357635}" srcOrd="0" destOrd="0" presId="urn:microsoft.com/office/officeart/2005/8/layout/default"/>
-    <dgm:cxn modelId="{31E6FBE2-0ACA-441F-ABE4-C7311CAC7B2A}" type="presParOf" srcId="{AEA3D86A-0484-4F9D-A099-D32E5BC381C4}" destId="{328CDBFB-495C-4F9E-B2A3-EF54F47EA8B6}" srcOrd="0" destOrd="0" presId="urn:microsoft.com/office/officeart/2005/8/layout/default"/>
-    <dgm:cxn modelId="{BF1ACD0D-E15E-41FE-96D0-FAB7A6708A65}" type="presParOf" srcId="{AEA3D86A-0484-4F9D-A099-D32E5BC381C4}" destId="{0991F25A-2C91-4E62-AFC2-0130D2CD64AB}" srcOrd="1" destOrd="0" presId="urn:microsoft.com/office/officeart/2005/8/layout/default"/>
-    <dgm:cxn modelId="{1BF589D4-C4DF-4248-B4CB-6B9E7E1F8F30}" type="presParOf" srcId="{AEA3D86A-0484-4F9D-A099-D32E5BC381C4}" destId="{9FB35D74-3983-4302-96C9-E2CDDE357635}" srcOrd="2" destOrd="0" presId="urn:microsoft.com/office/officeart/2005/8/layout/default"/>
-    <dgm:cxn modelId="{0EA1F4A4-82A8-4FF3-A6C7-342DD7279AC8}" type="presParOf" srcId="{AEA3D86A-0484-4F9D-A099-D32E5BC381C4}" destId="{3507388A-25A7-4E23-97CF-DD5E3190A885}" srcOrd="3" destOrd="0" presId="urn:microsoft.com/office/officeart/2005/8/layout/default"/>
-    <dgm:cxn modelId="{2DC71A9C-596E-4F6E-B2CE-59645CBBDDCA}" type="presParOf" srcId="{AEA3D86A-0484-4F9D-A099-D32E5BC381C4}" destId="{5DE467AF-B7E2-42C5-A6F5-3FE74107E0DD}" srcOrd="4" destOrd="0" presId="urn:microsoft.com/office/officeart/2005/8/layout/default"/>
-    <dgm:cxn modelId="{84FEF8BC-BD1D-449B-90F8-A8B677DA780E}" type="presParOf" srcId="{AEA3D86A-0484-4F9D-A099-D32E5BC381C4}" destId="{538D52CD-E235-4955-885B-D5F2D36DE757}" srcOrd="5" destOrd="0" presId="urn:microsoft.com/office/officeart/2005/8/layout/default"/>
-    <dgm:cxn modelId="{D228FE96-3C39-494B-AFDF-0631D36C0379}" type="presParOf" srcId="{AEA3D86A-0484-4F9D-A099-D32E5BC381C4}" destId="{F65EA607-E87D-49EF-A5DF-DF0C184738F5}" srcOrd="6" destOrd="0" presId="urn:microsoft.com/office/officeart/2005/8/layout/default"/>
-    <dgm:cxn modelId="{63425FBA-2D39-46A6-8AAD-1A260B29C02E}" type="presParOf" srcId="{AEA3D86A-0484-4F9D-A099-D32E5BC381C4}" destId="{C59DB586-F998-486E-A8AD-C46BD15D3135}" srcOrd="7" destOrd="0" presId="urn:microsoft.com/office/officeart/2005/8/layout/default"/>
-    <dgm:cxn modelId="{8881E5DA-3899-420A-B4DB-35C48A45E332}" type="presParOf" srcId="{AEA3D86A-0484-4F9D-A099-D32E5BC381C4}" destId="{546C8C6B-92D1-446A-B8EB-2BF3CC6CABC4}" srcOrd="8" destOrd="0" presId="urn:microsoft.com/office/officeart/2005/8/layout/default"/>
-    <dgm:cxn modelId="{69C49FCA-998F-47DB-A329-B415833827B1}" type="presParOf" srcId="{AEA3D86A-0484-4F9D-A099-D32E5BC381C4}" destId="{02671605-0496-45F8-826D-BC4420D1B67A}" srcOrd="9" destOrd="0" presId="urn:microsoft.com/office/officeart/2005/8/layout/default"/>
-    <dgm:cxn modelId="{1736F447-F8D1-41BA-9E1E-3568C302F888}" type="presParOf" srcId="{AEA3D86A-0484-4F9D-A099-D32E5BC381C4}" destId="{B2F27306-FCCA-478A-A75A-A14C0ECD389D}" srcOrd="10" destOrd="0" presId="urn:microsoft.com/office/officeart/2005/8/layout/default"/>
-    <dgm:cxn modelId="{F707E283-C6EA-4045-A3C6-75F807138FF4}" type="presParOf" srcId="{AEA3D86A-0484-4F9D-A099-D32E5BC381C4}" destId="{A0FCB0BF-F6A4-4B6C-B2E7-A9EDB1E19D5A}" srcOrd="11" destOrd="0" presId="urn:microsoft.com/office/officeart/2005/8/layout/default"/>
-    <dgm:cxn modelId="{352FC53B-4272-4A58-B146-52DB462535DB}" type="presParOf" srcId="{AEA3D86A-0484-4F9D-A099-D32E5BC381C4}" destId="{429C31D0-4D18-4C99-B72B-4E01415F2E48}" srcOrd="12" destOrd="0" presId="urn:microsoft.com/office/officeart/2005/8/layout/default"/>
+    <dgm:cxn modelId="{240ED1D7-A841-4C32-AC8D-A8B897C3A6FA}" type="presOf" srcId="{E32A4DE3-B1E7-4D7B-8880-13414145CEC7}" destId="{429C31D0-4D18-4C99-B72B-4E01415F2E48}" srcOrd="0" destOrd="0" presId="urn:microsoft.com/office/officeart/2005/8/layout/default"/>
+    <dgm:cxn modelId="{C986F5E6-2D28-406A-9512-AA1B5415B165}" type="presOf" srcId="{326AB8E0-7A9A-4DAB-9974-647167EF028F}" destId="{546C8C6B-92D1-446A-B8EB-2BF3CC6CABC4}" srcOrd="0" destOrd="0" presId="urn:microsoft.com/office/officeart/2005/8/layout/default"/>
+    <dgm:cxn modelId="{913CE9E0-CF73-408A-8097-1DB9F5241B34}" type="presOf" srcId="{C096F7B4-4EEE-4D0A-AF74-8096A5CFB2A3}" destId="{328CDBFB-495C-4F9E-B2A3-EF54F47EA8B6}" srcOrd="0" destOrd="0" presId="urn:microsoft.com/office/officeart/2005/8/layout/default"/>
+    <dgm:cxn modelId="{FA0B85C5-6E49-48AB-BFD8-2AB0A7F93A0C}" type="presParOf" srcId="{AEA3D86A-0484-4F9D-A099-D32E5BC381C4}" destId="{328CDBFB-495C-4F9E-B2A3-EF54F47EA8B6}" srcOrd="0" destOrd="0" presId="urn:microsoft.com/office/officeart/2005/8/layout/default"/>
+    <dgm:cxn modelId="{B8040D0B-4C6C-4B73-BC6F-82A053BF9486}" type="presParOf" srcId="{AEA3D86A-0484-4F9D-A099-D32E5BC381C4}" destId="{0991F25A-2C91-4E62-AFC2-0130D2CD64AB}" srcOrd="1" destOrd="0" presId="urn:microsoft.com/office/officeart/2005/8/layout/default"/>
+    <dgm:cxn modelId="{1EC3C8E7-E805-4AA7-AD88-73AE366C192D}" type="presParOf" srcId="{AEA3D86A-0484-4F9D-A099-D32E5BC381C4}" destId="{9FB35D74-3983-4302-96C9-E2CDDE357635}" srcOrd="2" destOrd="0" presId="urn:microsoft.com/office/officeart/2005/8/layout/default"/>
+    <dgm:cxn modelId="{022A1481-F291-4ED6-A636-F4A116513D03}" type="presParOf" srcId="{AEA3D86A-0484-4F9D-A099-D32E5BC381C4}" destId="{3507388A-25A7-4E23-97CF-DD5E3190A885}" srcOrd="3" destOrd="0" presId="urn:microsoft.com/office/officeart/2005/8/layout/default"/>
+    <dgm:cxn modelId="{9B0CADBB-5D23-44EA-A5CF-7DD14E3AE09A}" type="presParOf" srcId="{AEA3D86A-0484-4F9D-A099-D32E5BC381C4}" destId="{5DE467AF-B7E2-42C5-A6F5-3FE74107E0DD}" srcOrd="4" destOrd="0" presId="urn:microsoft.com/office/officeart/2005/8/layout/default"/>
+    <dgm:cxn modelId="{D6215F37-DB8A-44C2-87CC-488F7B4A883B}" type="presParOf" srcId="{AEA3D86A-0484-4F9D-A099-D32E5BC381C4}" destId="{538D52CD-E235-4955-885B-D5F2D36DE757}" srcOrd="5" destOrd="0" presId="urn:microsoft.com/office/officeart/2005/8/layout/default"/>
+    <dgm:cxn modelId="{0C20BEEA-9C16-454A-B18E-8963DBE76384}" type="presParOf" srcId="{AEA3D86A-0484-4F9D-A099-D32E5BC381C4}" destId="{F65EA607-E87D-49EF-A5DF-DF0C184738F5}" srcOrd="6" destOrd="0" presId="urn:microsoft.com/office/officeart/2005/8/layout/default"/>
+    <dgm:cxn modelId="{BB97156C-AAEC-410D-BD7F-8286B7D9009F}" type="presParOf" srcId="{AEA3D86A-0484-4F9D-A099-D32E5BC381C4}" destId="{C59DB586-F998-486E-A8AD-C46BD15D3135}" srcOrd="7" destOrd="0" presId="urn:microsoft.com/office/officeart/2005/8/layout/default"/>
+    <dgm:cxn modelId="{5D96BEC3-05E2-497C-9225-0C86E715617A}" type="presParOf" srcId="{AEA3D86A-0484-4F9D-A099-D32E5BC381C4}" destId="{546C8C6B-92D1-446A-B8EB-2BF3CC6CABC4}" srcOrd="8" destOrd="0" presId="urn:microsoft.com/office/officeart/2005/8/layout/default"/>
+    <dgm:cxn modelId="{ED34C599-155B-4533-82AF-126B4B36A132}" type="presParOf" srcId="{AEA3D86A-0484-4F9D-A099-D32E5BC381C4}" destId="{02671605-0496-45F8-826D-BC4420D1B67A}" srcOrd="9" destOrd="0" presId="urn:microsoft.com/office/officeart/2005/8/layout/default"/>
+    <dgm:cxn modelId="{F9BB4184-D5AE-4456-8179-18CCAF4ECC48}" type="presParOf" srcId="{AEA3D86A-0484-4F9D-A099-D32E5BC381C4}" destId="{B2F27306-FCCA-478A-A75A-A14C0ECD389D}" srcOrd="10" destOrd="0" presId="urn:microsoft.com/office/officeart/2005/8/layout/default"/>
+    <dgm:cxn modelId="{019F428C-AC25-427C-AADF-BB5FFB95CBD4}" type="presParOf" srcId="{AEA3D86A-0484-4F9D-A099-D32E5BC381C4}" destId="{A0FCB0BF-F6A4-4B6C-B2E7-A9EDB1E19D5A}" srcOrd="11" destOrd="0" presId="urn:microsoft.com/office/officeart/2005/8/layout/default"/>
+    <dgm:cxn modelId="{9BD8A919-F5F1-4B1A-9F37-93A849938CA4}" type="presParOf" srcId="{AEA3D86A-0484-4F9D-A099-D32E5BC381C4}" destId="{429C31D0-4D18-4C99-B72B-4E01415F2E48}" srcOrd="12" destOrd="0" presId="urn:microsoft.com/office/officeart/2005/8/layout/default"/>
   </dgm:cxnLst>
   <dgm:bg/>
   <dgm:whole/>
@@ -33205,41 +33250,41 @@
     </dgm:pt>
   </dgm:ptLst>
   <dgm:cxnLst>
+    <dgm:cxn modelId="{9996AD6F-0165-414C-82EC-6FC1DBC97B7F}" type="presOf" srcId="{00965194-33B3-4E0F-B33F-4C28A6CD598D}" destId="{9D6495A4-9EFD-4002-9D46-3915F718D14F}" srcOrd="0" destOrd="0" presId="urn:microsoft.com/office/officeart/2005/8/layout/vProcess5"/>
     <dgm:cxn modelId="{2CA62164-C237-49F3-B917-6E658561573A}" srcId="{6A84FFCD-10FC-4BBD-A8BE-561195D48367}" destId="{0AEF3932-E0AD-48BA-AD4C-10EA64BDE481}" srcOrd="3" destOrd="0" parTransId="{C9F31AD3-9E12-42EC-A0E7-189087A9E050}" sibTransId="{419E4E53-0438-49B7-A339-51892CD7A04D}"/>
-    <dgm:cxn modelId="{8DD62C12-2B7C-42F4-8AFF-72B8C54B9AD7}" type="presOf" srcId="{0AEF3932-E0AD-48BA-AD4C-10EA64BDE481}" destId="{63EB70B8-7035-4623-97EC-5180F16D7773}" srcOrd="1" destOrd="0" presId="urn:microsoft.com/office/officeart/2005/8/layout/vProcess5"/>
-    <dgm:cxn modelId="{76F0FDED-07E2-4F18-8E32-66DF09537CCF}" type="presOf" srcId="{F0EDAA2D-7819-4DA8-B402-278199E4248D}" destId="{AE079B32-6DF3-496F-95CB-059079090266}" srcOrd="1" destOrd="0" presId="urn:microsoft.com/office/officeart/2005/8/layout/vProcess5"/>
+    <dgm:cxn modelId="{EA26E197-D958-4640-9F3D-5AF6AD44C617}" type="presOf" srcId="{00965194-33B3-4E0F-B33F-4C28A6CD598D}" destId="{907D9B38-6CFF-4D90-A8FA-497350D02618}" srcOrd="1" destOrd="0" presId="urn:microsoft.com/office/officeart/2005/8/layout/vProcess5"/>
+    <dgm:cxn modelId="{1EAEC295-23FD-4D32-9BCF-C1F828326CBD}" type="presOf" srcId="{0AEF3932-E0AD-48BA-AD4C-10EA64BDE481}" destId="{06F0AF9C-6673-4471-824E-BB64CDD7877E}" srcOrd="0" destOrd="0" presId="urn:microsoft.com/office/officeart/2005/8/layout/vProcess5"/>
+    <dgm:cxn modelId="{BE11498B-0F1D-4654-A6AD-E3478323596A}" type="presOf" srcId="{4E24CAD3-BE75-43F6-870E-7A270E4C3C37}" destId="{8120AC12-C4CC-4D7F-B082-5C5A49D5DD87}" srcOrd="1" destOrd="0" presId="urn:microsoft.com/office/officeart/2005/8/layout/vProcess5"/>
+    <dgm:cxn modelId="{883E5EDC-9ECA-47F3-A138-EC4C4A7E2F19}" type="presOf" srcId="{8CEE8830-B4D9-4AE1-8628-97678DF0C107}" destId="{B7551AEC-CE9E-4345-B021-AA29CCB1E406}" srcOrd="0" destOrd="0" presId="urn:microsoft.com/office/officeart/2005/8/layout/vProcess5"/>
     <dgm:cxn modelId="{F1004537-49ED-48BA-A58E-13F68644FF1A}" srcId="{6A84FFCD-10FC-4BBD-A8BE-561195D48367}" destId="{4E24CAD3-BE75-43F6-870E-7A270E4C3C37}" srcOrd="2" destOrd="0" parTransId="{C5439C06-93D0-4F9D-B511-4F0FFF96BCDB}" sibTransId="{7F189A78-6644-493A-9C96-849427784EAD}"/>
-    <dgm:cxn modelId="{5120BB84-9524-4F7F-9E0E-45A796119C9E}" type="presOf" srcId="{419E4E53-0438-49B7-A339-51892CD7A04D}" destId="{69EB81C9-49C4-4CD2-8707-2E20C36443D2}" srcOrd="0" destOrd="0" presId="urn:microsoft.com/office/officeart/2005/8/layout/vProcess5"/>
-    <dgm:cxn modelId="{E8BDE395-6B87-4282-9EBA-9C0386790909}" type="presOf" srcId="{00965194-33B3-4E0F-B33F-4C28A6CD598D}" destId="{907D9B38-6CFF-4D90-A8FA-497350D02618}" srcOrd="1" destOrd="0" presId="urn:microsoft.com/office/officeart/2005/8/layout/vProcess5"/>
-    <dgm:cxn modelId="{4FFF354F-8DF2-4329-89BC-64BE7BF5014A}" type="presOf" srcId="{FA38CA03-EF5A-466F-8344-3C3B47663B8A}" destId="{0D39A822-CF19-42DE-A5A4-2C16B3A50F2D}" srcOrd="0" destOrd="0" presId="urn:microsoft.com/office/officeart/2005/8/layout/vProcess5"/>
-    <dgm:cxn modelId="{EC80E75C-D237-4CD8-82BE-8D51B3CE32D8}" type="presOf" srcId="{8CEE8830-B4D9-4AE1-8628-97678DF0C107}" destId="{B7551AEC-CE9E-4345-B021-AA29CCB1E406}" srcOrd="0" destOrd="0" presId="urn:microsoft.com/office/officeart/2005/8/layout/vProcess5"/>
+    <dgm:cxn modelId="{381EC586-F687-4613-A3EE-C3F59628C050}" type="presOf" srcId="{6A84FFCD-10FC-4BBD-A8BE-561195D48367}" destId="{8D2BB52A-A7DC-41D6-A000-FE1F6BA134E4}" srcOrd="0" destOrd="0" presId="urn:microsoft.com/office/officeart/2005/8/layout/vProcess5"/>
+    <dgm:cxn modelId="{D3B61B2B-8733-40A1-9B75-6A9E2F6AA8D4}" type="presOf" srcId="{4E24CAD3-BE75-43F6-870E-7A270E4C3C37}" destId="{35100D57-B479-4D3B-9829-7FA28B5FD004}" srcOrd="0" destOrd="0" presId="urn:microsoft.com/office/officeart/2005/8/layout/vProcess5"/>
     <dgm:cxn modelId="{8F38CA09-6D78-403A-A497-9A673D52F64A}" srcId="{6A84FFCD-10FC-4BBD-A8BE-561195D48367}" destId="{F0EDAA2D-7819-4DA8-B402-278199E4248D}" srcOrd="4" destOrd="0" parTransId="{F3848FC3-12B8-4375-93CF-F7B7E5E1456B}" sibTransId="{2F2C4599-D338-433D-AE5B-E4A888E8CCD7}"/>
-    <dgm:cxn modelId="{9AAC45E3-1876-449A-91C2-773AA2A28727}" type="presOf" srcId="{4E24CAD3-BE75-43F6-870E-7A270E4C3C37}" destId="{35100D57-B479-4D3B-9829-7FA28B5FD004}" srcOrd="0" destOrd="0" presId="urn:microsoft.com/office/officeart/2005/8/layout/vProcess5"/>
-    <dgm:cxn modelId="{EE95BB18-F08B-4AEF-9419-1CF30175C6B2}" type="presOf" srcId="{0AEF3932-E0AD-48BA-AD4C-10EA64BDE481}" destId="{06F0AF9C-6673-4471-824E-BB64CDD7877E}" srcOrd="0" destOrd="0" presId="urn:microsoft.com/office/officeart/2005/8/layout/vProcess5"/>
-    <dgm:cxn modelId="{215DB48E-6BC2-41B3-BD04-8E32AE4AE43E}" type="presOf" srcId="{FA38CA03-EF5A-466F-8344-3C3B47663B8A}" destId="{3622C091-9DE4-42DF-9CAB-386032D2472D}" srcOrd="1" destOrd="0" presId="urn:microsoft.com/office/officeart/2005/8/layout/vProcess5"/>
     <dgm:cxn modelId="{15630943-0995-4D96-94C0-A179A72A7167}" srcId="{6A84FFCD-10FC-4BBD-A8BE-561195D48367}" destId="{FA38CA03-EF5A-466F-8344-3C3B47663B8A}" srcOrd="0" destOrd="0" parTransId="{8FCC8D85-04D0-4147-B5C0-9B0DA07726F8}" sibTransId="{C004DF57-6337-4229-8408-BEE3F5109154}"/>
-    <dgm:cxn modelId="{40C7B002-4EE6-4BE5-8E59-FF698DF872F3}" type="presOf" srcId="{7F189A78-6644-493A-9C96-849427784EAD}" destId="{6C44C1BE-550C-4D78-B158-3DC1FFF62CC9}" srcOrd="0" destOrd="0" presId="urn:microsoft.com/office/officeart/2005/8/layout/vProcess5"/>
-    <dgm:cxn modelId="{B456C689-9572-4D74-ABA5-8CB55D3BC6F8}" type="presOf" srcId="{00965194-33B3-4E0F-B33F-4C28A6CD598D}" destId="{9D6495A4-9EFD-4002-9D46-3915F718D14F}" srcOrd="0" destOrd="0" presId="urn:microsoft.com/office/officeart/2005/8/layout/vProcess5"/>
+    <dgm:cxn modelId="{0B6CF277-EE8A-4377-AAD9-5187D5536551}" type="presOf" srcId="{0AEF3932-E0AD-48BA-AD4C-10EA64BDE481}" destId="{63EB70B8-7035-4623-97EC-5180F16D7773}" srcOrd="1" destOrd="0" presId="urn:microsoft.com/office/officeart/2005/8/layout/vProcess5"/>
+    <dgm:cxn modelId="{CD09C351-98FF-463B-81E0-F2E237906647}" type="presOf" srcId="{F0EDAA2D-7819-4DA8-B402-278199E4248D}" destId="{AE079B32-6DF3-496F-95CB-059079090266}" srcOrd="1" destOrd="0" presId="urn:microsoft.com/office/officeart/2005/8/layout/vProcess5"/>
     <dgm:cxn modelId="{6809D078-2429-4E43-BD52-A058F9EA3FC4}" srcId="{6A84FFCD-10FC-4BBD-A8BE-561195D48367}" destId="{00965194-33B3-4E0F-B33F-4C28A6CD598D}" srcOrd="1" destOrd="0" parTransId="{B62E70EB-1831-4BC1-8DAB-0503F55F1171}" sibTransId="{8CEE8830-B4D9-4AE1-8628-97678DF0C107}"/>
-    <dgm:cxn modelId="{F69FD99F-529D-4FDD-B531-4DECD9F4D3DF}" type="presOf" srcId="{C004DF57-6337-4229-8408-BEE3F5109154}" destId="{89CC23AC-6AB8-4D43-A34E-F7B3CAA79A13}" srcOrd="0" destOrd="0" presId="urn:microsoft.com/office/officeart/2005/8/layout/vProcess5"/>
-    <dgm:cxn modelId="{97F42E61-7873-460A-B71E-274FFE61E587}" type="presOf" srcId="{4E24CAD3-BE75-43F6-870E-7A270E4C3C37}" destId="{8120AC12-C4CC-4D7F-B082-5C5A49D5DD87}" srcOrd="1" destOrd="0" presId="urn:microsoft.com/office/officeart/2005/8/layout/vProcess5"/>
-    <dgm:cxn modelId="{63EFDBDE-754A-4955-AA90-93E9FE97AD45}" type="presOf" srcId="{6A84FFCD-10FC-4BBD-A8BE-561195D48367}" destId="{8D2BB52A-A7DC-41D6-A000-FE1F6BA134E4}" srcOrd="0" destOrd="0" presId="urn:microsoft.com/office/officeart/2005/8/layout/vProcess5"/>
-    <dgm:cxn modelId="{87A0EA2E-7C85-4922-A400-AF2D033AFD41}" type="presOf" srcId="{F0EDAA2D-7819-4DA8-B402-278199E4248D}" destId="{ED9EB096-5B7A-4AA3-A779-317EB030C036}" srcOrd="0" destOrd="0" presId="urn:microsoft.com/office/officeart/2005/8/layout/vProcess5"/>
-    <dgm:cxn modelId="{57B92659-B8C1-4BED-BF29-D18DB720BF9F}" type="presParOf" srcId="{8D2BB52A-A7DC-41D6-A000-FE1F6BA134E4}" destId="{AF30F2D5-74C7-4DAE-BE2C-AD821F41E1C4}" srcOrd="0" destOrd="0" presId="urn:microsoft.com/office/officeart/2005/8/layout/vProcess5"/>
-    <dgm:cxn modelId="{470CAF87-4BDF-4399-BFC1-9D8F7BCB2A5B}" type="presParOf" srcId="{8D2BB52A-A7DC-41D6-A000-FE1F6BA134E4}" destId="{0D39A822-CF19-42DE-A5A4-2C16B3A50F2D}" srcOrd="1" destOrd="0" presId="urn:microsoft.com/office/officeart/2005/8/layout/vProcess5"/>
-    <dgm:cxn modelId="{8084B3EC-6DB2-4AC6-908B-B80A533C8376}" type="presParOf" srcId="{8D2BB52A-A7DC-41D6-A000-FE1F6BA134E4}" destId="{9D6495A4-9EFD-4002-9D46-3915F718D14F}" srcOrd="2" destOrd="0" presId="urn:microsoft.com/office/officeart/2005/8/layout/vProcess5"/>
-    <dgm:cxn modelId="{9DDA4233-13FE-4916-9B3D-762209F00B6E}" type="presParOf" srcId="{8D2BB52A-A7DC-41D6-A000-FE1F6BA134E4}" destId="{35100D57-B479-4D3B-9829-7FA28B5FD004}" srcOrd="3" destOrd="0" presId="urn:microsoft.com/office/officeart/2005/8/layout/vProcess5"/>
-    <dgm:cxn modelId="{6D21494D-46A9-4E9F-A60D-3B9A1D2E330D}" type="presParOf" srcId="{8D2BB52A-A7DC-41D6-A000-FE1F6BA134E4}" destId="{06F0AF9C-6673-4471-824E-BB64CDD7877E}" srcOrd="4" destOrd="0" presId="urn:microsoft.com/office/officeart/2005/8/layout/vProcess5"/>
-    <dgm:cxn modelId="{9C8E7CB3-6645-4208-8AD9-1A6F9341C0C8}" type="presParOf" srcId="{8D2BB52A-A7DC-41D6-A000-FE1F6BA134E4}" destId="{ED9EB096-5B7A-4AA3-A779-317EB030C036}" srcOrd="5" destOrd="0" presId="urn:microsoft.com/office/officeart/2005/8/layout/vProcess5"/>
-    <dgm:cxn modelId="{3EC57F06-C314-4AD7-AD9E-A9442C9871BE}" type="presParOf" srcId="{8D2BB52A-A7DC-41D6-A000-FE1F6BA134E4}" destId="{89CC23AC-6AB8-4D43-A34E-F7B3CAA79A13}" srcOrd="6" destOrd="0" presId="urn:microsoft.com/office/officeart/2005/8/layout/vProcess5"/>
-    <dgm:cxn modelId="{328A8E41-9DF2-4E40-B0A9-5FD44D5432BF}" type="presParOf" srcId="{8D2BB52A-A7DC-41D6-A000-FE1F6BA134E4}" destId="{B7551AEC-CE9E-4345-B021-AA29CCB1E406}" srcOrd="7" destOrd="0" presId="urn:microsoft.com/office/officeart/2005/8/layout/vProcess5"/>
-    <dgm:cxn modelId="{CDCC0DD3-E4B8-4510-ABF6-DDCD5A763F5D}" type="presParOf" srcId="{8D2BB52A-A7DC-41D6-A000-FE1F6BA134E4}" destId="{6C44C1BE-550C-4D78-B158-3DC1FFF62CC9}" srcOrd="8" destOrd="0" presId="urn:microsoft.com/office/officeart/2005/8/layout/vProcess5"/>
-    <dgm:cxn modelId="{2F1BD39A-2650-4E02-B519-780FDF8E6673}" type="presParOf" srcId="{8D2BB52A-A7DC-41D6-A000-FE1F6BA134E4}" destId="{69EB81C9-49C4-4CD2-8707-2E20C36443D2}" srcOrd="9" destOrd="0" presId="urn:microsoft.com/office/officeart/2005/8/layout/vProcess5"/>
-    <dgm:cxn modelId="{D855A482-CCBC-42F0-8BD0-4D3D19E831E1}" type="presParOf" srcId="{8D2BB52A-A7DC-41D6-A000-FE1F6BA134E4}" destId="{3622C091-9DE4-42DF-9CAB-386032D2472D}" srcOrd="10" destOrd="0" presId="urn:microsoft.com/office/officeart/2005/8/layout/vProcess5"/>
-    <dgm:cxn modelId="{55A6C725-6385-4D77-AFCC-99B5AF29B885}" type="presParOf" srcId="{8D2BB52A-A7DC-41D6-A000-FE1F6BA134E4}" destId="{907D9B38-6CFF-4D90-A8FA-497350D02618}" srcOrd="11" destOrd="0" presId="urn:microsoft.com/office/officeart/2005/8/layout/vProcess5"/>
-    <dgm:cxn modelId="{9441E80A-A23C-4C53-8372-BADA24AE8C64}" type="presParOf" srcId="{8D2BB52A-A7DC-41D6-A000-FE1F6BA134E4}" destId="{8120AC12-C4CC-4D7F-B082-5C5A49D5DD87}" srcOrd="12" destOrd="0" presId="urn:microsoft.com/office/officeart/2005/8/layout/vProcess5"/>
-    <dgm:cxn modelId="{A5EC3038-1ADF-4704-9EC2-DBA2E0D4B6FF}" type="presParOf" srcId="{8D2BB52A-A7DC-41D6-A000-FE1F6BA134E4}" destId="{63EB70B8-7035-4623-97EC-5180F16D7773}" srcOrd="13" destOrd="0" presId="urn:microsoft.com/office/officeart/2005/8/layout/vProcess5"/>
-    <dgm:cxn modelId="{D1485C39-3F3F-4AC2-8948-68AA00BB7E81}" type="presParOf" srcId="{8D2BB52A-A7DC-41D6-A000-FE1F6BA134E4}" destId="{AE079B32-6DF3-496F-95CB-059079090266}" srcOrd="14" destOrd="0" presId="urn:microsoft.com/office/officeart/2005/8/layout/vProcess5"/>
+    <dgm:cxn modelId="{0989765A-DC71-400D-ACB5-3146EB4470EF}" type="presOf" srcId="{7F189A78-6644-493A-9C96-849427784EAD}" destId="{6C44C1BE-550C-4D78-B158-3DC1FFF62CC9}" srcOrd="0" destOrd="0" presId="urn:microsoft.com/office/officeart/2005/8/layout/vProcess5"/>
+    <dgm:cxn modelId="{9FD94FCD-E89A-4281-8BC9-7852DE17BAF8}" type="presOf" srcId="{FA38CA03-EF5A-466F-8344-3C3B47663B8A}" destId="{0D39A822-CF19-42DE-A5A4-2C16B3A50F2D}" srcOrd="0" destOrd="0" presId="urn:microsoft.com/office/officeart/2005/8/layout/vProcess5"/>
+    <dgm:cxn modelId="{1A6DF726-9961-4248-A5C4-A04C83001E81}" type="presOf" srcId="{419E4E53-0438-49B7-A339-51892CD7A04D}" destId="{69EB81C9-49C4-4CD2-8707-2E20C36443D2}" srcOrd="0" destOrd="0" presId="urn:microsoft.com/office/officeart/2005/8/layout/vProcess5"/>
+    <dgm:cxn modelId="{64E8BF9E-4693-4DA7-9EBF-3121BBB4F399}" type="presOf" srcId="{F0EDAA2D-7819-4DA8-B402-278199E4248D}" destId="{ED9EB096-5B7A-4AA3-A779-317EB030C036}" srcOrd="0" destOrd="0" presId="urn:microsoft.com/office/officeart/2005/8/layout/vProcess5"/>
+    <dgm:cxn modelId="{67A21881-03D7-4899-B8AC-832823F23C77}" type="presOf" srcId="{C004DF57-6337-4229-8408-BEE3F5109154}" destId="{89CC23AC-6AB8-4D43-A34E-F7B3CAA79A13}" srcOrd="0" destOrd="0" presId="urn:microsoft.com/office/officeart/2005/8/layout/vProcess5"/>
+    <dgm:cxn modelId="{9F3B49E5-8144-4339-AF0B-2E5071C93377}" type="presOf" srcId="{FA38CA03-EF5A-466F-8344-3C3B47663B8A}" destId="{3622C091-9DE4-42DF-9CAB-386032D2472D}" srcOrd="1" destOrd="0" presId="urn:microsoft.com/office/officeart/2005/8/layout/vProcess5"/>
+    <dgm:cxn modelId="{4D118756-D8A1-4E26-A5DC-9D4EA81CF837}" type="presParOf" srcId="{8D2BB52A-A7DC-41D6-A000-FE1F6BA134E4}" destId="{AF30F2D5-74C7-4DAE-BE2C-AD821F41E1C4}" srcOrd="0" destOrd="0" presId="urn:microsoft.com/office/officeart/2005/8/layout/vProcess5"/>
+    <dgm:cxn modelId="{83F61B7D-4324-4372-999F-B74A92821089}" type="presParOf" srcId="{8D2BB52A-A7DC-41D6-A000-FE1F6BA134E4}" destId="{0D39A822-CF19-42DE-A5A4-2C16B3A50F2D}" srcOrd="1" destOrd="0" presId="urn:microsoft.com/office/officeart/2005/8/layout/vProcess5"/>
+    <dgm:cxn modelId="{207A6276-80FC-42B3-AF81-BBF984D15C96}" type="presParOf" srcId="{8D2BB52A-A7DC-41D6-A000-FE1F6BA134E4}" destId="{9D6495A4-9EFD-4002-9D46-3915F718D14F}" srcOrd="2" destOrd="0" presId="urn:microsoft.com/office/officeart/2005/8/layout/vProcess5"/>
+    <dgm:cxn modelId="{E4CC1744-ABA6-429C-9DBD-554A9BE7862A}" type="presParOf" srcId="{8D2BB52A-A7DC-41D6-A000-FE1F6BA134E4}" destId="{35100D57-B479-4D3B-9829-7FA28B5FD004}" srcOrd="3" destOrd="0" presId="urn:microsoft.com/office/officeart/2005/8/layout/vProcess5"/>
+    <dgm:cxn modelId="{8990A345-1BA2-475E-ADEC-1E81B2BAE56B}" type="presParOf" srcId="{8D2BB52A-A7DC-41D6-A000-FE1F6BA134E4}" destId="{06F0AF9C-6673-4471-824E-BB64CDD7877E}" srcOrd="4" destOrd="0" presId="urn:microsoft.com/office/officeart/2005/8/layout/vProcess5"/>
+    <dgm:cxn modelId="{D859C17B-11FC-40FE-8B85-E6AACC3E3728}" type="presParOf" srcId="{8D2BB52A-A7DC-41D6-A000-FE1F6BA134E4}" destId="{ED9EB096-5B7A-4AA3-A779-317EB030C036}" srcOrd="5" destOrd="0" presId="urn:microsoft.com/office/officeart/2005/8/layout/vProcess5"/>
+    <dgm:cxn modelId="{3E84AAD7-168B-40D8-9530-B3E75911D963}" type="presParOf" srcId="{8D2BB52A-A7DC-41D6-A000-FE1F6BA134E4}" destId="{89CC23AC-6AB8-4D43-A34E-F7B3CAA79A13}" srcOrd="6" destOrd="0" presId="urn:microsoft.com/office/officeart/2005/8/layout/vProcess5"/>
+    <dgm:cxn modelId="{F3BB578B-E3EB-4F4E-9251-5A01587145A8}" type="presParOf" srcId="{8D2BB52A-A7DC-41D6-A000-FE1F6BA134E4}" destId="{B7551AEC-CE9E-4345-B021-AA29CCB1E406}" srcOrd="7" destOrd="0" presId="urn:microsoft.com/office/officeart/2005/8/layout/vProcess5"/>
+    <dgm:cxn modelId="{74DD8084-9F00-4A56-9A87-1CD36596C42B}" type="presParOf" srcId="{8D2BB52A-A7DC-41D6-A000-FE1F6BA134E4}" destId="{6C44C1BE-550C-4D78-B158-3DC1FFF62CC9}" srcOrd="8" destOrd="0" presId="urn:microsoft.com/office/officeart/2005/8/layout/vProcess5"/>
+    <dgm:cxn modelId="{4D77F991-3FF4-4E52-B064-13CDD6525CD5}" type="presParOf" srcId="{8D2BB52A-A7DC-41D6-A000-FE1F6BA134E4}" destId="{69EB81C9-49C4-4CD2-8707-2E20C36443D2}" srcOrd="9" destOrd="0" presId="urn:microsoft.com/office/officeart/2005/8/layout/vProcess5"/>
+    <dgm:cxn modelId="{088DD8AD-FA79-4BE4-933F-DA500241F14F}" type="presParOf" srcId="{8D2BB52A-A7DC-41D6-A000-FE1F6BA134E4}" destId="{3622C091-9DE4-42DF-9CAB-386032D2472D}" srcOrd="10" destOrd="0" presId="urn:microsoft.com/office/officeart/2005/8/layout/vProcess5"/>
+    <dgm:cxn modelId="{11075249-2BA7-4DC7-A2E3-7DB5DF8F2781}" type="presParOf" srcId="{8D2BB52A-A7DC-41D6-A000-FE1F6BA134E4}" destId="{907D9B38-6CFF-4D90-A8FA-497350D02618}" srcOrd="11" destOrd="0" presId="urn:microsoft.com/office/officeart/2005/8/layout/vProcess5"/>
+    <dgm:cxn modelId="{1E5047CE-5E87-44AE-A0C4-B75B7CD69372}" type="presParOf" srcId="{8D2BB52A-A7DC-41D6-A000-FE1F6BA134E4}" destId="{8120AC12-C4CC-4D7F-B082-5C5A49D5DD87}" srcOrd="12" destOrd="0" presId="urn:microsoft.com/office/officeart/2005/8/layout/vProcess5"/>
+    <dgm:cxn modelId="{5F92A14C-4703-488E-93FF-C593C53FEC53}" type="presParOf" srcId="{8D2BB52A-A7DC-41D6-A000-FE1F6BA134E4}" destId="{63EB70B8-7035-4623-97EC-5180F16D7773}" srcOrd="13" destOrd="0" presId="urn:microsoft.com/office/officeart/2005/8/layout/vProcess5"/>
+    <dgm:cxn modelId="{E9C02401-0A40-4648-B8E5-EE6BCD04DC40}" type="presParOf" srcId="{8D2BB52A-A7DC-41D6-A000-FE1F6BA134E4}" destId="{AE079B32-6DF3-496F-95CB-059079090266}" srcOrd="14" destOrd="0" presId="urn:microsoft.com/office/officeart/2005/8/layout/vProcess5"/>
   </dgm:cxnLst>
   <dgm:bg/>
   <dgm:whole/>
@@ -38520,7 +38565,7 @@
 </file>
 
 <file path=customXml/itemProps1.xml><?xml version="1.0" encoding="utf-8"?>
-<ds:datastoreItem xmlns:ds="http://schemas.openxmlformats.org/officeDocument/2006/customXml" ds:itemID="{4ED5AC56-7FCB-4DD2-91E0-4496B5C56C70}">
+<ds:datastoreItem xmlns:ds="http://schemas.openxmlformats.org/officeDocument/2006/customXml" ds:itemID="{F3A8BBFB-FCD8-4162-A120-F93D8A40E2A9}">
   <ds:schemaRefs>
     <ds:schemaRef ds:uri="http://schemas.openxmlformats.org/officeDocument/2006/bibliography"/>
   </ds:schemaRefs>

</xml_diff>